<commit_message>
aggiunta SSD LanciaDadi, SpostaPedina, PassaDalVia
</commit_message>
<xml_diff>
--- a/analisiDeiRequisiti.docx
+++ b/analisiDeiRequisiti.docx
@@ -1,12 +1,11 @@
 
 <file path=word/document.xml><?xml version="1.0" encoding="utf-8"?>
-<w:document xmlns:wpc="http://schemas.microsoft.com/office/word/2010/wordprocessingCanvas" xmlns:cx="http://schemas.microsoft.com/office/drawing/2014/chartex" xmlns:cx1="http://schemas.microsoft.com/office/drawing/2015/9/8/chartex" xmlns:cx2="http://schemas.microsoft.com/office/drawing/2015/10/21/chartex" xmlns:cx3="http://schemas.microsoft.com/office/drawing/2016/5/9/chartex" xmlns:cx4="http://schemas.microsoft.com/office/drawing/2016/5/10/chartex" xmlns:cx5="http://schemas.microsoft.com/office/drawing/2016/5/11/chartex" xmlns:cx6="http://schemas.microsoft.com/office/drawing/2016/5/12/chartex" xmlns:cx7="http://schemas.microsoft.com/office/drawing/2016/5/13/chartex" xmlns:cx8="http://schemas.microsoft.com/office/drawing/2016/5/14/chartex" xmlns:mc="http://schemas.openxmlformats.org/markup-compatibility/2006" xmlns:aink="http://schemas.microsoft.com/office/drawing/2016/ink" xmlns:am3d="http://schemas.microsoft.com/office/drawing/2017/model3d" xmlns:o="urn:schemas-microsoft-com:office:office" xmlns:oel="http://schemas.microsoft.com/office/2019/extlst" xmlns:r="http://schemas.openxmlformats.org/officeDocument/2006/relationships" xmlns:m="http://schemas.openxmlformats.org/officeDocument/2006/math" xmlns:v="urn:schemas-microsoft-com:vml" xmlns:wp14="http://schemas.microsoft.com/office/word/2010/wordprocessingDrawing" xmlns:wp="http://schemas.openxmlformats.org/drawingml/2006/wordprocessingDrawing" xmlns:w10="urn:schemas-microsoft-com:office:word" xmlns:w="http://schemas.openxmlformats.org/wordprocessingml/2006/main" xmlns:w14="http://schemas.microsoft.com/office/word/2010/wordml" xmlns:w15="http://schemas.microsoft.com/office/word/2012/wordml" xmlns:w16cex="http://schemas.microsoft.com/office/word/2018/wordml/cex" xmlns:w16cid="http://schemas.microsoft.com/office/word/2016/wordml/cid" xmlns:w16="http://schemas.microsoft.com/office/word/2018/wordml" xmlns:w16du="http://schemas.microsoft.com/office/word/2023/wordml/word16du" xmlns:w16sdtdh="http://schemas.microsoft.com/office/word/2020/wordml/sdtdatahash" xmlns:w16sdtfl="http://schemas.microsoft.com/office/word/2024/wordml/sdtformatlock" xmlns:w16se="http://schemas.microsoft.com/office/word/2015/wordml/symex" xmlns:wpg="http://schemas.microsoft.com/office/word/2010/wordprocessingGroup" xmlns:wpi="http://schemas.microsoft.com/office/word/2010/wordprocessingInk" xmlns:wne="http://schemas.microsoft.com/office/word/2006/wordml" xmlns:wps="http://schemas.microsoft.com/office/word/2010/wordprocessingShape" mc:Ignorable="w14 w15 w16se w16cid w16 w16cex w16sdtdh w16sdtfl w16du wp14">
+<w:document xmlns:wpc="http://schemas.microsoft.com/office/word/2010/wordprocessingCanvas" xmlns:cx="http://schemas.microsoft.com/office/drawing/2014/chartex" xmlns:cx1="http://schemas.microsoft.com/office/drawing/2015/9/8/chartex" xmlns:cx2="http://schemas.microsoft.com/office/drawing/2015/10/21/chartex" xmlns:cx3="http://schemas.microsoft.com/office/drawing/2016/5/9/chartex" xmlns:cx4="http://schemas.microsoft.com/office/drawing/2016/5/10/chartex" xmlns:cx5="http://schemas.microsoft.com/office/drawing/2016/5/11/chartex" xmlns:cx6="http://schemas.microsoft.com/office/drawing/2016/5/12/chartex" xmlns:cx7="http://schemas.microsoft.com/office/drawing/2016/5/13/chartex" xmlns:cx8="http://schemas.microsoft.com/office/drawing/2016/5/14/chartex" xmlns:mc="http://schemas.openxmlformats.org/markup-compatibility/2006" xmlns:aink="http://schemas.microsoft.com/office/drawing/2016/ink" xmlns:am3d="http://schemas.microsoft.com/office/drawing/2017/model3d" xmlns:o="urn:schemas-microsoft-com:office:office" xmlns:oel="http://schemas.microsoft.com/office/2019/extlst" xmlns:r="http://schemas.openxmlformats.org/officeDocument/2006/relationships" xmlns:m="http://schemas.openxmlformats.org/officeDocument/2006/math" xmlns:v="urn:schemas-microsoft-com:vml" xmlns:wp14="http://schemas.microsoft.com/office/word/2010/wordprocessingDrawing" xmlns:wp="http://schemas.openxmlformats.org/drawingml/2006/wordprocessingDrawing" xmlns:w10="urn:schemas-microsoft-com:office:word" xmlns:w="http://schemas.openxmlformats.org/wordprocessingml/2006/main" xmlns:w14="http://schemas.microsoft.com/office/word/2010/wordml" xmlns:w15="http://schemas.microsoft.com/office/word/2012/wordml" xmlns:w16cex="http://schemas.microsoft.com/office/word/2018/wordml/cex" xmlns:w16cid="http://schemas.microsoft.com/office/word/2016/wordml/cid" xmlns:w16="http://schemas.microsoft.com/office/word/2018/wordml" xmlns:w16sdtdh="http://schemas.microsoft.com/office/word/2020/wordml/sdtdatahash" xmlns:w16se="http://schemas.microsoft.com/office/word/2015/wordml/symex" xmlns:wpg="http://schemas.microsoft.com/office/word/2010/wordprocessingGroup" xmlns:wpi="http://schemas.microsoft.com/office/word/2010/wordprocessingInk" xmlns:wne="http://schemas.microsoft.com/office/word/2006/wordml" xmlns:wps="http://schemas.microsoft.com/office/word/2010/wordprocessingShape" mc:Ignorable="w14 w15 w16se w16cid w16 w16cex w16sdtdh wp14">
   <w:body>
     <w:p>
       <w:pPr>
         <w:ind w:left="708"/>
       </w:pPr>
-      <w:proofErr w:type="spellStart"/>
       <w:r>
         <w:rPr>
           <w:b/>
@@ -14,7 +13,6 @@
         </w:rPr>
         <w:t>NewMonopoly</w:t>
       </w:r>
-      <w:proofErr w:type="spellEnd"/>
     </w:p>
     <w:p>
       <w:pPr>
@@ -48,15 +46,7 @@
         <w:ind w:left="708"/>
       </w:pPr>
       <w:r>
-        <w:t xml:space="preserve">In questo progetto, svilupperai una versione </w:t>
-      </w:r>
-      <w:proofErr w:type="spellStart"/>
-      <w:r>
-        <w:t>client-server</w:t>
-      </w:r>
-      <w:proofErr w:type="spellEnd"/>
-      <w:r>
-        <w:t xml:space="preserve"> altamente configurabile e a turni del gioco del Monopoli che supera le limitazioni sopra menzionate.</w:t>
+        <w:t>In questo progetto, svilupperai una versione client-server altamente configurabile e a turni del gioco del Monopoli che supera le limitazioni sopra menzionate.</w:t>
       </w:r>
     </w:p>
     <w:p>
@@ -72,14 +62,7 @@
       </w:r>
       <w:r>
         <w:br/>
-      </w:r>
-      <w:proofErr w:type="spellStart"/>
-      <w:r>
-        <w:t>NewMonopoly</w:t>
-      </w:r>
-      <w:proofErr w:type="spellEnd"/>
-      <w:r>
-        <w:t xml:space="preserve"> è una versione computerizzata e altamente configurabile del gioco del Monopoli. Monopoli è un gioco da tavolo a turni, giocato su un tabellone che raffigura 40 caselle contenenti: 28 proprietà, cioè 22 strade (classificate in 8 gruppi di colore), 4 stazioni ferroviarie e 2 utenze; 3 caselle Probabilità; 3 caselle Imprevisti; una casella Tassa di Lusso; una casella Tassa sul Reddito; e 4 angoli (Partenza, Prigione/In Visita, Parcheggio Gratuito, e Vai in Prigione). Lo scopo del gioco è mandare gli avversari in bancarotta, lasciando un unico monopolista a controllare l'economia. Ogni giocatore inizia il gioco con un segnalino sulla casella Partenza e 1.500 di una valuta locale in denaro fittizio suddiviso in banconote da 1, 5, 10, 20, 50, 100 e 500. Il movimento dei segnalini sul tabellone è determinato dal lancio dei dadi.</w:t>
+        <w:t>NewMonopoly è una versione computerizzata e altamente configurabile del gioco del Monopoli. Monopoli è un gioco da tavolo a turni, giocato su un tabellone che raffigura 40 caselle contenenti: 28 proprietà, cioè 22 strade (classificate in 8 gruppi di colore), 4 stazioni ferroviarie e 2 utenze; 3 caselle Probabilità; 3 caselle Imprevisti; una casella Tassa di Lusso; una casella Tassa sul Reddito; e 4 angoli (Partenza, Prigione/In Visita, Parcheggio Gratuito, e Vai in Prigione). Lo scopo del gioco è mandare gli avversari in bancarotta, lasciando un unico monopolista a controllare l'economia. Ogni giocatore inizia il gioco con un segnalino sulla casella Partenza e 1.500 di una valuta locale in denaro fittizio suddiviso in banconote da 1, 5, 10, 20, 50, 100 e 500. Il movimento dei segnalini sul tabellone è determinato dal lancio dei dadi.</w:t>
       </w:r>
     </w:p>
     <w:p>
@@ -87,42 +70,24 @@
         <w:ind w:left="708"/>
       </w:pPr>
       <w:r>
-        <w:t xml:space="preserve">L'obiettivo di questo progetto è creare una versione </w:t>
-      </w:r>
-      <w:proofErr w:type="spellStart"/>
-      <w:r>
-        <w:t>client-server</w:t>
-      </w:r>
-      <w:proofErr w:type="spellEnd"/>
-      <w:r>
-        <w:t xml:space="preserve"> a turni di </w:t>
-      </w:r>
-      <w:proofErr w:type="spellStart"/>
-      <w:r>
-        <w:t>NewMonopoly</w:t>
-      </w:r>
-      <w:proofErr w:type="spellEnd"/>
-      <w:r>
-        <w:t xml:space="preserve"> con alta configurabilità, in cui gli utenti giocano attraverso un sito web. Il gioco deve implementare tutte le funzionalità principali della versione standard del Monopoli (vedi </w:t>
+        <w:t xml:space="preserve">L'obiettivo di questo progetto è creare una versione client-server a turni di NewMonopoly con alta configurabilità, in cui gli utenti giocano attraverso un sito web. Il gioco deve implementare tutte le funzionalità principali della versione standard del Monopoli (vedi </w:t>
       </w:r>
       <w:hyperlink r:id="rId9" w:tgtFrame="_new" w:history="1">
-        <w:proofErr w:type="spellStart"/>
         <w:r>
           <w:rPr>
-            <w:rStyle w:val="Collegamentoipertestuale"/>
+            <w:rStyle w:val="Hyperlink"/>
           </w:rPr>
           <w:t>Wikipe</w:t>
         </w:r>
-        <w:proofErr w:type="spellEnd"/>
         <w:r>
           <w:rPr>
-            <w:rStyle w:val="Collegamentoipertestuale"/>
+            <w:rStyle w:val="Hyperlink"/>
           </w:rPr>
           <w:t xml:space="preserve"> </w:t>
         </w:r>
         <w:r>
           <w:rPr>
-            <w:rStyle w:val="Collegamentoipertestuale"/>
+            <w:rStyle w:val="Hyperlink"/>
           </w:rPr>
           <w:t>dia</w:t>
         </w:r>
@@ -133,7 +98,7 @@
       <w:hyperlink r:id="rId10" w:tgtFrame="_new" w:history="1">
         <w:r>
           <w:rPr>
-            <w:rStyle w:val="Collegamentoipertestuale"/>
+            <w:rStyle w:val="Hyperlink"/>
           </w:rPr>
           <w:t>WikiHow</w:t>
         </w:r>
@@ -220,23 +185,7 @@
       </w:r>
       <w:r>
         <w:br/>
-        <w:t xml:space="preserve">Il progetto deve implementare le funzionalità descritte sopra, cioè tutte le regole del Monopoli standard più le caratteristiche di configurabilità. </w:t>
-      </w:r>
-      <w:proofErr w:type="gramStart"/>
-      <w:r>
-        <w:t>I team</w:t>
-      </w:r>
-      <w:proofErr w:type="gramEnd"/>
-      <w:r>
-        <w:t xml:space="preserve"> possono scegliere la piattaforma di sviluppo, inclusi gli strumenti e i linguaggi di programmazione da utilizzare. Poiché il gioco è basato sul web, i framework MVC possono essere utili. </w:t>
-      </w:r>
-      <w:proofErr w:type="gramStart"/>
-      <w:r>
-        <w:t>I team</w:t>
-      </w:r>
-      <w:proofErr w:type="gramEnd"/>
-      <w:r>
-        <w:t xml:space="preserve"> devono anche fornire documentazione, inclusi un documento sui requisiti, un documento di progettazione e un breve manuale utente (installazione e modalità di gioco).</w:t>
+        <w:t>Il progetto deve implementare le funzionalità descritte sopra, cioè tutte le regole del Monopoli standard più le caratteristiche di configurabilità. I team possono scegliere la piattaforma di sviluppo, inclusi gli strumenti e i linguaggi di programmazione da utilizzare. Poiché il gioco è basato sul web, i framework MVC possono essere utili. I team devono anche fornire documentazione, inclusi un documento sui requisiti, un documento di progettazione e un breve manuale utente (installazione e modalità di gioco).</w:t>
       </w:r>
     </w:p>
     <w:p>
@@ -246,7 +195,7 @@
     </w:p>
     <w:p>
       <w:pPr>
-        <w:pStyle w:val="Titolo1"/>
+        <w:pStyle w:val="Heading1"/>
       </w:pPr>
       <w:r>
         <w:lastRenderedPageBreak/>
@@ -255,7 +204,7 @@
     </w:p>
     <w:p>
       <w:pPr>
-        <w:pStyle w:val="Paragrafoelenco"/>
+        <w:pStyle w:val="ListParagraph"/>
         <w:numPr>
           <w:ilvl w:val="0"/>
           <w:numId w:val="22"/>
@@ -275,7 +224,7 @@
     </w:p>
     <w:p>
       <w:pPr>
-        <w:pStyle w:val="Paragrafoelenco"/>
+        <w:pStyle w:val="ListParagraph"/>
         <w:numPr>
           <w:ilvl w:val="0"/>
           <w:numId w:val="17"/>
@@ -290,7 +239,7 @@
     </w:p>
     <w:p>
       <w:pPr>
-        <w:pStyle w:val="Paragrafoelenco"/>
+        <w:pStyle w:val="ListParagraph"/>
         <w:numPr>
           <w:ilvl w:val="0"/>
           <w:numId w:val="17"/>
@@ -308,7 +257,7 @@
     </w:p>
     <w:p>
       <w:pPr>
-        <w:pStyle w:val="Paragrafoelenco"/>
+        <w:pStyle w:val="ListParagraph"/>
         <w:numPr>
           <w:ilvl w:val="0"/>
           <w:numId w:val="17"/>
@@ -332,7 +281,7 @@
     </w:p>
     <w:p>
       <w:pPr>
-        <w:pStyle w:val="Paragrafoelenco"/>
+        <w:pStyle w:val="ListParagraph"/>
         <w:numPr>
           <w:ilvl w:val="0"/>
           <w:numId w:val="22"/>
@@ -354,7 +303,7 @@
     </w:p>
     <w:p>
       <w:pPr>
-        <w:pStyle w:val="Paragrafoelenco"/>
+        <w:pStyle w:val="ListParagraph"/>
         <w:numPr>
           <w:ilvl w:val="0"/>
           <w:numId w:val="22"/>
@@ -374,7 +323,7 @@
     </w:p>
     <w:p>
       <w:pPr>
-        <w:pStyle w:val="Paragrafoelenco"/>
+        <w:pStyle w:val="ListParagraph"/>
         <w:numPr>
           <w:ilvl w:val="0"/>
           <w:numId w:val="17"/>
@@ -389,7 +338,7 @@
     </w:p>
     <w:p>
       <w:pPr>
-        <w:pStyle w:val="Paragrafoelenco"/>
+        <w:pStyle w:val="ListParagraph"/>
         <w:numPr>
           <w:ilvl w:val="0"/>
           <w:numId w:val="17"/>
@@ -404,7 +353,7 @@
     </w:p>
     <w:p>
       <w:pPr>
-        <w:pStyle w:val="Paragrafoelenco"/>
+        <w:pStyle w:val="ListParagraph"/>
         <w:numPr>
           <w:ilvl w:val="0"/>
           <w:numId w:val="17"/>
@@ -422,28 +371,28 @@
       <w:commentRangeEnd w:id="0"/>
       <w:r>
         <w:rPr>
-          <w:rStyle w:val="Rimandocommento"/>
+          <w:rStyle w:val="CommentReference"/>
         </w:rPr>
         <w:commentReference w:id="0"/>
       </w:r>
       <w:commentRangeEnd w:id="1"/>
       <w:r>
         <w:rPr>
-          <w:rStyle w:val="Rimandocommento"/>
+          <w:rStyle w:val="CommentReference"/>
         </w:rPr>
         <w:commentReference w:id="1"/>
       </w:r>
       <w:commentRangeEnd w:id="2"/>
       <w:r>
         <w:rPr>
-          <w:rStyle w:val="Rimandocommento"/>
+          <w:rStyle w:val="CommentReference"/>
         </w:rPr>
         <w:commentReference w:id="2"/>
       </w:r>
     </w:p>
     <w:p>
       <w:pPr>
-        <w:pStyle w:val="Paragrafoelenco"/>
+        <w:pStyle w:val="ListParagraph"/>
         <w:numPr>
           <w:ilvl w:val="0"/>
           <w:numId w:val="17"/>
@@ -455,7 +404,7 @@
     </w:p>
     <w:p>
       <w:pPr>
-        <w:pStyle w:val="Paragrafoelenco"/>
+        <w:pStyle w:val="ListParagraph"/>
         <w:numPr>
           <w:ilvl w:val="0"/>
           <w:numId w:val="17"/>
@@ -470,7 +419,7 @@
     </w:p>
     <w:p>
       <w:pPr>
-        <w:pStyle w:val="Paragrafoelenco"/>
+        <w:pStyle w:val="ListParagraph"/>
         <w:numPr>
           <w:ilvl w:val="0"/>
           <w:numId w:val="17"/>
@@ -485,7 +434,7 @@
     </w:p>
     <w:p>
       <w:pPr>
-        <w:pStyle w:val="Paragrafoelenco"/>
+        <w:pStyle w:val="ListParagraph"/>
         <w:numPr>
           <w:ilvl w:val="0"/>
           <w:numId w:val="17"/>
@@ -500,7 +449,7 @@
     </w:p>
     <w:p>
       <w:pPr>
-        <w:pStyle w:val="Paragrafoelenco"/>
+        <w:pStyle w:val="ListParagraph"/>
         <w:numPr>
           <w:ilvl w:val="0"/>
           <w:numId w:val="17"/>
@@ -515,7 +464,7 @@
     </w:p>
     <w:p>
       <w:pPr>
-        <w:pStyle w:val="Paragrafoelenco"/>
+        <w:pStyle w:val="ListParagraph"/>
         <w:numPr>
           <w:ilvl w:val="0"/>
           <w:numId w:val="22"/>
@@ -559,7 +508,7 @@
     <w:p/>
     <w:p>
       <w:pPr>
-        <w:pStyle w:val="Titolo2"/>
+        <w:pStyle w:val="Heading2"/>
       </w:pPr>
       <w:r>
         <w:t>Extra:</w:t>
@@ -567,7 +516,7 @@
     </w:p>
     <w:p>
       <w:pPr>
-        <w:pStyle w:val="Paragrafoelenco"/>
+        <w:pStyle w:val="ListParagraph"/>
         <w:numPr>
           <w:ilvl w:val="0"/>
           <w:numId w:val="22"/>
@@ -585,14 +534,14 @@
       <w:commentRangeEnd w:id="3"/>
       <w:r>
         <w:rPr>
-          <w:rStyle w:val="Rimandocommento"/>
+          <w:rStyle w:val="CommentReference"/>
         </w:rPr>
         <w:commentReference w:id="3"/>
       </w:r>
       <w:commentRangeEnd w:id="4"/>
       <w:r>
         <w:rPr>
-          <w:rStyle w:val="Rimandocommento"/>
+          <w:rStyle w:val="CommentReference"/>
         </w:rPr>
         <w:commentReference w:id="4"/>
       </w:r>
@@ -636,7 +585,7 @@
     </w:p>
     <w:p>
       <w:pPr>
-        <w:pStyle w:val="Paragrafoelenco"/>
+        <w:pStyle w:val="ListParagraph"/>
         <w:numPr>
           <w:ilvl w:val="0"/>
           <w:numId w:val="22"/>
@@ -666,15 +615,7 @@
         <w:t xml:space="preserve"> imposta per </w:t>
       </w:r>
       <w:r>
-        <w:t xml:space="preserve">ogni </w:t>
-      </w:r>
-      <w:proofErr w:type="gramStart"/>
-      <w:r>
-        <w:t>5</w:t>
-      </w:r>
-      <w:proofErr w:type="gramEnd"/>
-      <w:r>
-        <w:t xml:space="preserve"> turni un</w:t>
+        <w:t>ogni 5 turni un</w:t>
       </w:r>
       <w:r>
         <w:t xml:space="preserve"> “</w:t>
@@ -686,7 +627,7 @@
       <w:commentRangeEnd w:id="5"/>
       <w:r>
         <w:rPr>
-          <w:rStyle w:val="Rimandocommento"/>
+          <w:rStyle w:val="CommentReference"/>
         </w:rPr>
         <w:commentReference w:id="5"/>
       </w:r>
@@ -717,7 +658,7 @@
     </w:p>
     <w:p>
       <w:pPr>
-        <w:pStyle w:val="Paragrafoelenco"/>
+        <w:pStyle w:val="ListParagraph"/>
         <w:ind w:left="360"/>
       </w:pPr>
       <w:r>
@@ -732,7 +673,7 @@
     </w:p>
     <w:p>
       <w:pPr>
-        <w:pStyle w:val="Paragrafoelenco"/>
+        <w:pStyle w:val="ListParagraph"/>
         <w:numPr>
           <w:ilvl w:val="0"/>
           <w:numId w:val="17"/>
@@ -744,7 +685,7 @@
     </w:p>
     <w:p>
       <w:pPr>
-        <w:pStyle w:val="Paragrafoelenco"/>
+        <w:pStyle w:val="ListParagraph"/>
         <w:numPr>
           <w:ilvl w:val="0"/>
           <w:numId w:val="17"/>
@@ -756,7 +697,7 @@
     </w:p>
     <w:p>
       <w:pPr>
-        <w:pStyle w:val="Paragrafoelenco"/>
+        <w:pStyle w:val="ListParagraph"/>
         <w:numPr>
           <w:ilvl w:val="0"/>
           <w:numId w:val="17"/>
@@ -765,25 +706,19 @@
       <w:commentRangeStart w:id="6"/>
       <w:commentRangeStart w:id="7"/>
       <w:r>
-        <w:t xml:space="preserve">Quando passi dal via hai il </w:t>
-      </w:r>
-      <w:r>
-        <w:t xml:space="preserve">un tot </w:t>
-      </w:r>
-      <w:r>
-        <w:t>in più dei soldi (se raggiungi una certa soglia totale di punti)</w:t>
+        <w:t>Quando passi dal via hai un tot in più dei soldi (se raggiungi una certa soglia totale di punti)</w:t>
       </w:r>
       <w:commentRangeEnd w:id="6"/>
       <w:r>
         <w:rPr>
-          <w:rStyle w:val="Rimandocommento"/>
+          <w:rStyle w:val="CommentReference"/>
         </w:rPr>
         <w:commentReference w:id="6"/>
       </w:r>
       <w:commentRangeEnd w:id="7"/>
       <w:r>
         <w:rPr>
-          <w:rStyle w:val="Rimandocommento"/>
+          <w:rStyle w:val="CommentReference"/>
         </w:rPr>
         <w:commentReference w:id="7"/>
       </w:r>
@@ -793,7 +728,7 @@
     </w:p>
     <w:p>
       <w:pPr>
-        <w:pStyle w:val="Paragrafoelenco"/>
+        <w:pStyle w:val="ListParagraph"/>
         <w:numPr>
           <w:ilvl w:val="0"/>
           <w:numId w:val="17"/>
@@ -805,7 +740,7 @@
     </w:p>
     <w:p>
       <w:pPr>
-        <w:pStyle w:val="Paragrafoelenco"/>
+        <w:pStyle w:val="ListParagraph"/>
         <w:numPr>
           <w:ilvl w:val="0"/>
           <w:numId w:val="22"/>
@@ -827,7 +762,7 @@
     </w:p>
     <w:p>
       <w:pPr>
-        <w:pStyle w:val="Paragrafoelenco"/>
+        <w:pStyle w:val="ListParagraph"/>
         <w:numPr>
           <w:ilvl w:val="0"/>
           <w:numId w:val="22"/>
@@ -846,7 +781,7 @@
     </w:p>
     <w:p>
       <w:pPr>
-        <w:pStyle w:val="Paragrafoelenco"/>
+        <w:pStyle w:val="ListParagraph"/>
         <w:numPr>
           <w:ilvl w:val="0"/>
           <w:numId w:val="17"/>
@@ -865,7 +800,7 @@
     </w:p>
     <w:p>
       <w:pPr>
-        <w:pStyle w:val="Paragrafoelenco"/>
+        <w:pStyle w:val="ListParagraph"/>
         <w:numPr>
           <w:ilvl w:val="1"/>
           <w:numId w:val="17"/>
@@ -880,7 +815,7 @@
     </w:p>
     <w:p>
       <w:pPr>
-        <w:pStyle w:val="Paragrafoelenco"/>
+        <w:pStyle w:val="ListParagraph"/>
         <w:numPr>
           <w:ilvl w:val="1"/>
           <w:numId w:val="17"/>
@@ -895,7 +830,7 @@
     </w:p>
     <w:p>
       <w:pPr>
-        <w:pStyle w:val="Paragrafoelenco"/>
+        <w:pStyle w:val="ListParagraph"/>
         <w:numPr>
           <w:ilvl w:val="2"/>
           <w:numId w:val="17"/>
@@ -907,7 +842,7 @@
     </w:p>
     <w:p>
       <w:pPr>
-        <w:pStyle w:val="Paragrafoelenco"/>
+        <w:pStyle w:val="ListParagraph"/>
         <w:numPr>
           <w:ilvl w:val="2"/>
           <w:numId w:val="17"/>
@@ -931,7 +866,7 @@
     </w:p>
     <w:p>
       <w:pPr>
-        <w:pStyle w:val="Paragrafoelenco"/>
+        <w:pStyle w:val="ListParagraph"/>
         <w:numPr>
           <w:ilvl w:val="1"/>
           <w:numId w:val="17"/>
@@ -944,15 +879,12 @@
         <w:t>à:</w:t>
       </w:r>
       <w:r>
-        <w:t xml:space="preserve"> </w:t>
-      </w:r>
-      <w:r>
-        <w:t>(100 punti = 10€)</w:t>
-      </w:r>
-    </w:p>
-    <w:p>
-      <w:pPr>
-        <w:pStyle w:val="Paragrafoelenco"/>
+        <w:t xml:space="preserve"> (100 punti = 10€)</w:t>
+      </w:r>
+    </w:p>
+    <w:p>
+      <w:pPr>
+        <w:pStyle w:val="ListParagraph"/>
         <w:numPr>
           <w:ilvl w:val="2"/>
           <w:numId w:val="17"/>
@@ -964,7 +896,7 @@
     </w:p>
     <w:p>
       <w:pPr>
-        <w:pStyle w:val="Paragrafoelenco"/>
+        <w:pStyle w:val="ListParagraph"/>
         <w:numPr>
           <w:ilvl w:val="0"/>
           <w:numId w:val="17"/>
@@ -985,7 +917,7 @@
     </w:p>
     <w:p>
       <w:pPr>
-        <w:pStyle w:val="Paragrafoelenco"/>
+        <w:pStyle w:val="ListParagraph"/>
         <w:numPr>
           <w:ilvl w:val="1"/>
           <w:numId w:val="17"/>
@@ -997,7 +929,7 @@
     </w:p>
     <w:p>
       <w:pPr>
-        <w:pStyle w:val="Paragrafoelenco"/>
+        <w:pStyle w:val="ListParagraph"/>
         <w:numPr>
           <w:ilvl w:val="1"/>
           <w:numId w:val="17"/>
@@ -1009,25 +941,19 @@
     </w:p>
     <w:p>
       <w:pPr>
-        <w:pStyle w:val="Paragrafoelenco"/>
+        <w:pStyle w:val="ListParagraph"/>
         <w:numPr>
           <w:ilvl w:val="2"/>
           <w:numId w:val="17"/>
         </w:numPr>
       </w:pPr>
       <w:r>
-        <w:t xml:space="preserve">Saldo iniziale di </w:t>
-      </w:r>
-      <w:r>
-        <w:t>9</w:t>
-      </w:r>
-      <w:r>
-        <w:t>00€;</w:t>
-      </w:r>
-    </w:p>
-    <w:p>
-      <w:pPr>
-        <w:pStyle w:val="Paragrafoelenco"/>
+        <w:t>Saldo iniziale di 900€;</w:t>
+      </w:r>
+    </w:p>
+    <w:p>
+      <w:pPr>
+        <w:pStyle w:val="ListParagraph"/>
         <w:numPr>
           <w:ilvl w:val="2"/>
           <w:numId w:val="17"/>
@@ -1057,7 +983,7 @@
     </w:p>
     <w:p>
       <w:pPr>
-        <w:pStyle w:val="Paragrafoelenco"/>
+        <w:pStyle w:val="ListParagraph"/>
         <w:numPr>
           <w:ilvl w:val="2"/>
           <w:numId w:val="17"/>
@@ -1069,7 +995,7 @@
     </w:p>
     <w:p>
       <w:pPr>
-        <w:pStyle w:val="Paragrafoelenco"/>
+        <w:pStyle w:val="ListParagraph"/>
         <w:numPr>
           <w:ilvl w:val="1"/>
           <w:numId w:val="17"/>
@@ -1084,7 +1010,7 @@
     </w:p>
     <w:p>
       <w:pPr>
-        <w:pStyle w:val="Paragrafoelenco"/>
+        <w:pStyle w:val="ListParagraph"/>
         <w:numPr>
           <w:ilvl w:val="2"/>
           <w:numId w:val="17"/>
@@ -1102,7 +1028,7 @@
     </w:p>
     <w:p>
       <w:pPr>
-        <w:pStyle w:val="Paragrafoelenco"/>
+        <w:pStyle w:val="ListParagraph"/>
         <w:numPr>
           <w:ilvl w:val="0"/>
           <w:numId w:val="17"/>
@@ -1129,7 +1055,7 @@
     </w:p>
     <w:p>
       <w:pPr>
-        <w:pStyle w:val="Paragrafoelenco"/>
+        <w:pStyle w:val="ListParagraph"/>
         <w:numPr>
           <w:ilvl w:val="1"/>
           <w:numId w:val="17"/>
@@ -1141,7 +1067,7 @@
     </w:p>
     <w:p>
       <w:pPr>
-        <w:pStyle w:val="Paragrafoelenco"/>
+        <w:pStyle w:val="ListParagraph"/>
         <w:numPr>
           <w:ilvl w:val="1"/>
           <w:numId w:val="17"/>
@@ -1153,7 +1079,7 @@
     </w:p>
     <w:p>
       <w:pPr>
-        <w:pStyle w:val="Paragrafoelenco"/>
+        <w:pStyle w:val="ListParagraph"/>
         <w:numPr>
           <w:ilvl w:val="2"/>
           <w:numId w:val="17"/>
@@ -1171,7 +1097,7 @@
     </w:p>
     <w:p>
       <w:pPr>
-        <w:pStyle w:val="Paragrafoelenco"/>
+        <w:pStyle w:val="ListParagraph"/>
         <w:numPr>
           <w:ilvl w:val="2"/>
           <w:numId w:val="17"/>
@@ -1192,7 +1118,7 @@
     </w:p>
     <w:p>
       <w:pPr>
-        <w:pStyle w:val="Paragrafoelenco"/>
+        <w:pStyle w:val="ListParagraph"/>
         <w:numPr>
           <w:ilvl w:val="2"/>
           <w:numId w:val="17"/>
@@ -1204,7 +1130,7 @@
     </w:p>
     <w:p>
       <w:pPr>
-        <w:pStyle w:val="Paragrafoelenco"/>
+        <w:pStyle w:val="ListParagraph"/>
         <w:numPr>
           <w:ilvl w:val="1"/>
           <w:numId w:val="17"/>
@@ -1222,7 +1148,7 @@
     </w:p>
     <w:p>
       <w:pPr>
-        <w:pStyle w:val="Paragrafoelenco"/>
+        <w:pStyle w:val="ListParagraph"/>
         <w:numPr>
           <w:ilvl w:val="2"/>
           <w:numId w:val="17"/>
@@ -1243,7 +1169,7 @@
     </w:p>
     <w:p>
       <w:pPr>
-        <w:pStyle w:val="Paragrafoelenco"/>
+        <w:pStyle w:val="ListParagraph"/>
         <w:numPr>
           <w:ilvl w:val="0"/>
           <w:numId w:val="22"/>
@@ -1263,7 +1189,7 @@
       <w:commentRangeEnd w:id="8"/>
       <w:r>
         <w:rPr>
-          <w:rStyle w:val="Rimandocommento"/>
+          <w:rStyle w:val="CommentReference"/>
         </w:rPr>
         <w:commentReference w:id="8"/>
       </w:r>
@@ -1273,7 +1199,7 @@
     </w:p>
     <w:p>
       <w:pPr>
-        <w:pStyle w:val="Paragrafoelenco"/>
+        <w:pStyle w:val="ListParagraph"/>
         <w:numPr>
           <w:ilvl w:val="0"/>
           <w:numId w:val="22"/>
@@ -1300,7 +1226,7 @@
       <w:commentRangeEnd w:id="9"/>
       <w:r>
         <w:rPr>
-          <w:rStyle w:val="Rimandocommento"/>
+          <w:rStyle w:val="CommentReference"/>
         </w:rPr>
         <w:commentReference w:id="9"/>
       </w:r>
@@ -1310,7 +1236,7 @@
     </w:p>
     <w:p>
       <w:pPr>
-        <w:pStyle w:val="Paragrafoelenco"/>
+        <w:pStyle w:val="ListParagraph"/>
         <w:numPr>
           <w:ilvl w:val="0"/>
           <w:numId w:val="17"/>
@@ -1322,7 +1248,7 @@
     </w:p>
     <w:p>
       <w:pPr>
-        <w:pStyle w:val="Paragrafoelenco"/>
+        <w:pStyle w:val="ListParagraph"/>
         <w:numPr>
           <w:ilvl w:val="0"/>
           <w:numId w:val="17"/>
@@ -1344,15 +1270,15 @@
 </file>
 
 <file path=word/comments.xml><?xml version="1.0" encoding="utf-8"?>
-<w:comments xmlns:wpc="http://schemas.microsoft.com/office/word/2010/wordprocessingCanvas" xmlns:cx="http://schemas.microsoft.com/office/drawing/2014/chartex" xmlns:cx1="http://schemas.microsoft.com/office/drawing/2015/9/8/chartex" xmlns:cx2="http://schemas.microsoft.com/office/drawing/2015/10/21/chartex" xmlns:cx3="http://schemas.microsoft.com/office/drawing/2016/5/9/chartex" xmlns:cx4="http://schemas.microsoft.com/office/drawing/2016/5/10/chartex" xmlns:cx5="http://schemas.microsoft.com/office/drawing/2016/5/11/chartex" xmlns:cx6="http://schemas.microsoft.com/office/drawing/2016/5/12/chartex" xmlns:cx7="http://schemas.microsoft.com/office/drawing/2016/5/13/chartex" xmlns:cx8="http://schemas.microsoft.com/office/drawing/2016/5/14/chartex" xmlns:mc="http://schemas.openxmlformats.org/markup-compatibility/2006" xmlns:aink="http://schemas.microsoft.com/office/drawing/2016/ink" xmlns:am3d="http://schemas.microsoft.com/office/drawing/2017/model3d" xmlns:o="urn:schemas-microsoft-com:office:office" xmlns:oel="http://schemas.microsoft.com/office/2019/extlst" xmlns:r="http://schemas.openxmlformats.org/officeDocument/2006/relationships" xmlns:m="http://schemas.openxmlformats.org/officeDocument/2006/math" xmlns:v="urn:schemas-microsoft-com:vml" xmlns:wp14="http://schemas.microsoft.com/office/word/2010/wordprocessingDrawing" xmlns:wp="http://schemas.openxmlformats.org/drawingml/2006/wordprocessingDrawing" xmlns:w10="urn:schemas-microsoft-com:office:word" xmlns:w="http://schemas.openxmlformats.org/wordprocessingml/2006/main" xmlns:w14="http://schemas.microsoft.com/office/word/2010/wordml" xmlns:w15="http://schemas.microsoft.com/office/word/2012/wordml" xmlns:w16cex="http://schemas.microsoft.com/office/word/2018/wordml/cex" xmlns:w16cid="http://schemas.microsoft.com/office/word/2016/wordml/cid" xmlns:w16="http://schemas.microsoft.com/office/word/2018/wordml" xmlns:w16du="http://schemas.microsoft.com/office/word/2023/wordml/word16du" xmlns:w16sdtdh="http://schemas.microsoft.com/office/word/2020/wordml/sdtdatahash" xmlns:w16sdtfl="http://schemas.microsoft.com/office/word/2024/wordml/sdtformatlock" xmlns:w16se="http://schemas.microsoft.com/office/word/2015/wordml/symex" xmlns:wpg="http://schemas.microsoft.com/office/word/2010/wordprocessingGroup" xmlns:wpi="http://schemas.microsoft.com/office/word/2010/wordprocessingInk" xmlns:wne="http://schemas.microsoft.com/office/word/2006/wordml" xmlns:wps="http://schemas.microsoft.com/office/word/2010/wordprocessingShape" mc:Ignorable="w14 w15 w16se w16cid w16 w16cex w16sdtdh w16sdtfl w16du wp14">
+<w:comments xmlns:wpc="http://schemas.microsoft.com/office/word/2010/wordprocessingCanvas" xmlns:cx="http://schemas.microsoft.com/office/drawing/2014/chartex" xmlns:cx1="http://schemas.microsoft.com/office/drawing/2015/9/8/chartex" xmlns:cx2="http://schemas.microsoft.com/office/drawing/2015/10/21/chartex" xmlns:cx3="http://schemas.microsoft.com/office/drawing/2016/5/9/chartex" xmlns:cx4="http://schemas.microsoft.com/office/drawing/2016/5/10/chartex" xmlns:cx5="http://schemas.microsoft.com/office/drawing/2016/5/11/chartex" xmlns:cx6="http://schemas.microsoft.com/office/drawing/2016/5/12/chartex" xmlns:cx7="http://schemas.microsoft.com/office/drawing/2016/5/13/chartex" xmlns:cx8="http://schemas.microsoft.com/office/drawing/2016/5/14/chartex" xmlns:mc="http://schemas.openxmlformats.org/markup-compatibility/2006" xmlns:aink="http://schemas.microsoft.com/office/drawing/2016/ink" xmlns:am3d="http://schemas.microsoft.com/office/drawing/2017/model3d" xmlns:o="urn:schemas-microsoft-com:office:office" xmlns:oel="http://schemas.microsoft.com/office/2019/extlst" xmlns:r="http://schemas.openxmlformats.org/officeDocument/2006/relationships" xmlns:m="http://schemas.openxmlformats.org/officeDocument/2006/math" xmlns:v="urn:schemas-microsoft-com:vml" xmlns:wp14="http://schemas.microsoft.com/office/word/2010/wordprocessingDrawing" xmlns:wp="http://schemas.openxmlformats.org/drawingml/2006/wordprocessingDrawing" xmlns:w10="urn:schemas-microsoft-com:office:word" xmlns:w="http://schemas.openxmlformats.org/wordprocessingml/2006/main" xmlns:w14="http://schemas.microsoft.com/office/word/2010/wordml" xmlns:w15="http://schemas.microsoft.com/office/word/2012/wordml" xmlns:w16cex="http://schemas.microsoft.com/office/word/2018/wordml/cex" xmlns:w16cid="http://schemas.microsoft.com/office/word/2016/wordml/cid" xmlns:w16="http://schemas.microsoft.com/office/word/2018/wordml" xmlns:w16sdtdh="http://schemas.microsoft.com/office/word/2020/wordml/sdtdatahash" xmlns:w16se="http://schemas.microsoft.com/office/word/2015/wordml/symex" xmlns:wpg="http://schemas.microsoft.com/office/word/2010/wordprocessingGroup" xmlns:wpi="http://schemas.microsoft.com/office/word/2010/wordprocessingInk" xmlns:wne="http://schemas.microsoft.com/office/word/2006/wordml" xmlns:wps="http://schemas.microsoft.com/office/word/2010/wordprocessingShape" mc:Ignorable="w14 w15 w16se w16cid w16 w16cex w16sdtdh wp14">
   <w:comment w:id="0" w:author="f.tentori4@campus.unimib.it" w:date="2024-12-23T16:39:00Z" w:initials="FT">
     <w:p>
       <w:pPr>
-        <w:pStyle w:val="Testocommento"/>
+        <w:pStyle w:val="CommentText"/>
       </w:pPr>
       <w:r>
         <w:rPr>
-          <w:rStyle w:val="Rimandocommento"/>
+          <w:rStyle w:val="CommentReference"/>
         </w:rPr>
         <w:annotationRef/>
       </w:r>
@@ -1364,11 +1290,11 @@
   <w:comment w:id="1" w:author="f.tentori4@campus.unimib.it" w:date="2024-12-23T16:42:00Z" w:initials="FT">
     <w:p>
       <w:pPr>
-        <w:pStyle w:val="Testocommento"/>
+        <w:pStyle w:val="CommentText"/>
       </w:pPr>
       <w:r>
         <w:rPr>
-          <w:rStyle w:val="Rimandocommento"/>
+          <w:rStyle w:val="CommentReference"/>
         </w:rPr>
         <w:annotationRef/>
       </w:r>
@@ -1380,11 +1306,11 @@
   <w:comment w:id="2" w:author="m.ronchi38@campus.unimib.it" w:date="2024-12-23T17:01:00Z" w:initials="m">
     <w:p>
       <w:pPr>
-        <w:pStyle w:val="Testocommento"/>
+        <w:pStyle w:val="CommentText"/>
       </w:pPr>
       <w:r>
         <w:rPr>
-          <w:rStyle w:val="Rimandocommento"/>
+          <w:rStyle w:val="CommentReference"/>
         </w:rPr>
         <w:annotationRef/>
       </w:r>
@@ -1396,11 +1322,11 @@
   <w:comment w:id="3" w:author="f.tentori4@campus.unimib.it" w:date="2024-12-23T17:54:00Z" w:initials="FT">
     <w:p>
       <w:pPr>
-        <w:pStyle w:val="Testocommento"/>
+        <w:pStyle w:val="CommentText"/>
       </w:pPr>
       <w:r>
         <w:rPr>
-          <w:rStyle w:val="Rimandocommento"/>
+          <w:rStyle w:val="CommentReference"/>
         </w:rPr>
         <w:annotationRef/>
       </w:r>
@@ -1412,11 +1338,11 @@
   <w:comment w:id="4" w:author="f.tentori4@campus.unimib.it" w:date="2024-12-23T18:22:00Z" w:initials="FT">
     <w:p>
       <w:pPr>
-        <w:pStyle w:val="Testocommento"/>
+        <w:pStyle w:val="CommentText"/>
       </w:pPr>
       <w:r>
         <w:rPr>
-          <w:rStyle w:val="Rimandocommento"/>
+          <w:rStyle w:val="CommentReference"/>
         </w:rPr>
         <w:annotationRef/>
       </w:r>
@@ -1448,12 +1374,12 @@
     </w:p>
     <w:p>
       <w:pPr>
-        <w:pStyle w:val="Testocommento"/>
-      </w:pPr>
-    </w:p>
-    <w:p>
-      <w:pPr>
-        <w:pStyle w:val="Testocommento"/>
+        <w:pStyle w:val="CommentText"/>
+      </w:pPr>
+    </w:p>
+    <w:p>
+      <w:pPr>
+        <w:pStyle w:val="CommentText"/>
       </w:pPr>
       <w:r>
         <w:t>MODALITA CAMBIO CASELLE:</w:t>
@@ -1467,11 +1393,11 @@
   <w:comment w:id="5" w:author="m.ronchi38@campus.unimib.it" w:date="2024-12-23T17:05:00Z" w:initials="m">
     <w:p>
       <w:pPr>
-        <w:pStyle w:val="Testocommento"/>
+        <w:pStyle w:val="CommentText"/>
       </w:pPr>
       <w:r>
         <w:rPr>
-          <w:rStyle w:val="Rimandocommento"/>
+          <w:rStyle w:val="CommentReference"/>
         </w:rPr>
         <w:annotationRef/>
       </w:r>
@@ -1483,11 +1409,11 @@
   <w:comment w:id="6" w:author="m.ronchi38@campus.unimib.it" w:date="2024-12-23T17:47:00Z" w:initials="m">
     <w:p>
       <w:pPr>
-        <w:pStyle w:val="Testocommento"/>
+        <w:pStyle w:val="CommentText"/>
       </w:pPr>
       <w:r>
         <w:rPr>
-          <w:rStyle w:val="Rimandocommento"/>
+          <w:rStyle w:val="CommentReference"/>
         </w:rPr>
         <w:annotationRef/>
       </w:r>
@@ -1499,11 +1425,11 @@
   <w:comment w:id="7" w:author="m.ronchi38@campus.unimib.it" w:date="2024-12-23T17:48:00Z" w:initials="m">
     <w:p>
       <w:pPr>
-        <w:pStyle w:val="Testocommento"/>
+        <w:pStyle w:val="CommentText"/>
       </w:pPr>
       <w:r>
         <w:rPr>
-          <w:rStyle w:val="Rimandocommento"/>
+          <w:rStyle w:val="CommentReference"/>
         </w:rPr>
         <w:annotationRef/>
       </w:r>
@@ -1515,11 +1441,11 @@
   <w:comment w:id="8" w:author="m.ronchi38@campus.unimib.it" w:date="2024-12-23T18:21:00Z" w:initials="m">
     <w:p>
       <w:pPr>
-        <w:pStyle w:val="Testocommento"/>
+        <w:pStyle w:val="CommentText"/>
       </w:pPr>
       <w:r>
         <w:rPr>
-          <w:rStyle w:val="Rimandocommento"/>
+          <w:rStyle w:val="CommentReference"/>
         </w:rPr>
         <w:annotationRef/>
       </w:r>
@@ -1531,11 +1457,11 @@
   <w:comment w:id="9" w:author="m.ronchi38@campus.unimib.it" w:date="2024-12-23T18:21:00Z" w:initials="m">
     <w:p>
       <w:pPr>
-        <w:pStyle w:val="Testocommento"/>
+        <w:pStyle w:val="CommentText"/>
       </w:pPr>
       <w:r>
         <w:rPr>
-          <w:rStyle w:val="Rimandocommento"/>
+          <w:rStyle w:val="CommentReference"/>
         </w:rPr>
         <w:annotationRef/>
       </w:r>
@@ -1548,7 +1474,7 @@
 </file>
 
 <file path=word/commentsExtended.xml><?xml version="1.0" encoding="utf-8"?>
-<w15:commentsEx xmlns:wpc="http://schemas.microsoft.com/office/word/2010/wordprocessingCanvas" xmlns:cx="http://schemas.microsoft.com/office/drawing/2014/chartex" xmlns:cx1="http://schemas.microsoft.com/office/drawing/2015/9/8/chartex" xmlns:cx2="http://schemas.microsoft.com/office/drawing/2015/10/21/chartex" xmlns:cx3="http://schemas.microsoft.com/office/drawing/2016/5/9/chartex" xmlns:cx4="http://schemas.microsoft.com/office/drawing/2016/5/10/chartex" xmlns:cx5="http://schemas.microsoft.com/office/drawing/2016/5/11/chartex" xmlns:cx6="http://schemas.microsoft.com/office/drawing/2016/5/12/chartex" xmlns:cx7="http://schemas.microsoft.com/office/drawing/2016/5/13/chartex" xmlns:cx8="http://schemas.microsoft.com/office/drawing/2016/5/14/chartex" xmlns:mc="http://schemas.openxmlformats.org/markup-compatibility/2006" xmlns:aink="http://schemas.microsoft.com/office/drawing/2016/ink" xmlns:am3d="http://schemas.microsoft.com/office/drawing/2017/model3d" xmlns:o="urn:schemas-microsoft-com:office:office" xmlns:oel="http://schemas.microsoft.com/office/2019/extlst" xmlns:r="http://schemas.openxmlformats.org/officeDocument/2006/relationships" xmlns:m="http://schemas.openxmlformats.org/officeDocument/2006/math" xmlns:v="urn:schemas-microsoft-com:vml" xmlns:wp14="http://schemas.microsoft.com/office/word/2010/wordprocessingDrawing" xmlns:wp="http://schemas.openxmlformats.org/drawingml/2006/wordprocessingDrawing" xmlns:w10="urn:schemas-microsoft-com:office:word" xmlns:w="http://schemas.openxmlformats.org/wordprocessingml/2006/main" xmlns:w14="http://schemas.microsoft.com/office/word/2010/wordml" xmlns:w15="http://schemas.microsoft.com/office/word/2012/wordml" xmlns:w16cex="http://schemas.microsoft.com/office/word/2018/wordml/cex" xmlns:w16cid="http://schemas.microsoft.com/office/word/2016/wordml/cid" xmlns:w16="http://schemas.microsoft.com/office/word/2018/wordml" xmlns:w16du="http://schemas.microsoft.com/office/word/2023/wordml/word16du" xmlns:w16sdtdh="http://schemas.microsoft.com/office/word/2020/wordml/sdtdatahash" xmlns:w16sdtfl="http://schemas.microsoft.com/office/word/2024/wordml/sdtformatlock" xmlns:w16se="http://schemas.microsoft.com/office/word/2015/wordml/symex" xmlns:wpg="http://schemas.microsoft.com/office/word/2010/wordprocessingGroup" xmlns:wpi="http://schemas.microsoft.com/office/word/2010/wordprocessingInk" xmlns:wne="http://schemas.microsoft.com/office/word/2006/wordml" xmlns:wps="http://schemas.microsoft.com/office/word/2010/wordprocessingShape" mc:Ignorable="w14 w15 w16se w16cid w16 w16cex w16sdtdh w16sdtfl w16du wp14">
+<w15:commentsEx xmlns:wpc="http://schemas.microsoft.com/office/word/2010/wordprocessingCanvas" xmlns:cx="http://schemas.microsoft.com/office/drawing/2014/chartex" xmlns:cx1="http://schemas.microsoft.com/office/drawing/2015/9/8/chartex" xmlns:cx2="http://schemas.microsoft.com/office/drawing/2015/10/21/chartex" xmlns:cx3="http://schemas.microsoft.com/office/drawing/2016/5/9/chartex" xmlns:cx4="http://schemas.microsoft.com/office/drawing/2016/5/10/chartex" xmlns:cx5="http://schemas.microsoft.com/office/drawing/2016/5/11/chartex" xmlns:cx6="http://schemas.microsoft.com/office/drawing/2016/5/12/chartex" xmlns:cx7="http://schemas.microsoft.com/office/drawing/2016/5/13/chartex" xmlns:cx8="http://schemas.microsoft.com/office/drawing/2016/5/14/chartex" xmlns:mc="http://schemas.openxmlformats.org/markup-compatibility/2006" xmlns:aink="http://schemas.microsoft.com/office/drawing/2016/ink" xmlns:am3d="http://schemas.microsoft.com/office/drawing/2017/model3d" xmlns:o="urn:schemas-microsoft-com:office:office" xmlns:oel="http://schemas.microsoft.com/office/2019/extlst" xmlns:r="http://schemas.openxmlformats.org/officeDocument/2006/relationships" xmlns:m="http://schemas.openxmlformats.org/officeDocument/2006/math" xmlns:v="urn:schemas-microsoft-com:vml" xmlns:wp14="http://schemas.microsoft.com/office/word/2010/wordprocessingDrawing" xmlns:wp="http://schemas.openxmlformats.org/drawingml/2006/wordprocessingDrawing" xmlns:w10="urn:schemas-microsoft-com:office:word" xmlns:w="http://schemas.openxmlformats.org/wordprocessingml/2006/main" xmlns:w14="http://schemas.microsoft.com/office/word/2010/wordml" xmlns:w15="http://schemas.microsoft.com/office/word/2012/wordml" xmlns:w16cex="http://schemas.microsoft.com/office/word/2018/wordml/cex" xmlns:w16cid="http://schemas.microsoft.com/office/word/2016/wordml/cid" xmlns:w16="http://schemas.microsoft.com/office/word/2018/wordml" xmlns:w16sdtdh="http://schemas.microsoft.com/office/word/2020/wordml/sdtdatahash" xmlns:w16se="http://schemas.microsoft.com/office/word/2015/wordml/symex" xmlns:wpg="http://schemas.microsoft.com/office/word/2010/wordprocessingGroup" xmlns:wpi="http://schemas.microsoft.com/office/word/2010/wordprocessingInk" xmlns:wne="http://schemas.microsoft.com/office/word/2006/wordml" xmlns:wps="http://schemas.microsoft.com/office/word/2010/wordprocessingShape" mc:Ignorable="w14 w15 w16se w16cid w16 w16cex w16sdtdh wp14">
   <w15:commentEx w15:paraId="034318FB" w15:done="0"/>
   <w15:commentEx w15:paraId="75037570" w15:paraIdParent="034318FB" w15:done="0"/>
   <w15:commentEx w15:paraId="1340C9E6" w15:paraIdParent="034318FB" w15:done="0"/>
@@ -1563,7 +1489,7 @@
 </file>
 
 <file path=word/commentsExtensible.xml><?xml version="1.0" encoding="utf-8"?>
-<w16cex:commentsExtensible xmlns:wpc="http://schemas.microsoft.com/office/word/2010/wordprocessingCanvas" xmlns:cx="http://schemas.microsoft.com/office/drawing/2014/chartex" xmlns:cx1="http://schemas.microsoft.com/office/drawing/2015/9/8/chartex" xmlns:cx2="http://schemas.microsoft.com/office/drawing/2015/10/21/chartex" xmlns:cx3="http://schemas.microsoft.com/office/drawing/2016/5/9/chartex" xmlns:cx4="http://schemas.microsoft.com/office/drawing/2016/5/10/chartex" xmlns:cx5="http://schemas.microsoft.com/office/drawing/2016/5/11/chartex" xmlns:cx6="http://schemas.microsoft.com/office/drawing/2016/5/12/chartex" xmlns:cx7="http://schemas.microsoft.com/office/drawing/2016/5/13/chartex" xmlns:cx8="http://schemas.microsoft.com/office/drawing/2016/5/14/chartex" xmlns:cr="http://schemas.microsoft.com/office/comments/2020/reactions" xmlns:mc="http://schemas.openxmlformats.org/markup-compatibility/2006" xmlns:aink="http://schemas.microsoft.com/office/drawing/2016/ink" xmlns:am3d="http://schemas.microsoft.com/office/drawing/2017/model3d" xmlns:o="urn:schemas-microsoft-com:office:office" xmlns:oel="http://schemas.microsoft.com/office/2019/extlst" xmlns:r="http://schemas.openxmlformats.org/officeDocument/2006/relationships" xmlns:m="http://schemas.openxmlformats.org/officeDocument/2006/math" xmlns:v="urn:schemas-microsoft-com:vml" xmlns:wp14="http://schemas.microsoft.com/office/word/2010/wordprocessingDrawing" xmlns:wp="http://schemas.openxmlformats.org/drawingml/2006/wordprocessingDrawing" xmlns:w10="urn:schemas-microsoft-com:office:word" xmlns:w="http://schemas.openxmlformats.org/wordprocessingml/2006/main" xmlns:w14="http://schemas.microsoft.com/office/word/2010/wordml" xmlns:w15="http://schemas.microsoft.com/office/word/2012/wordml" xmlns:w16cex="http://schemas.microsoft.com/office/word/2018/wordml/cex" xmlns:w16cid="http://schemas.microsoft.com/office/word/2016/wordml/cid" xmlns:w16="http://schemas.microsoft.com/office/word/2018/wordml" xmlns:w16du="http://schemas.microsoft.com/office/word/2023/wordml/word16du" xmlns:w16sdtdh="http://schemas.microsoft.com/office/word/2020/wordml/sdtdatahash" xmlns:w16sdtfl="http://schemas.microsoft.com/office/word/2024/wordml/sdtformatlock" xmlns:w16se="http://schemas.microsoft.com/office/word/2015/wordml/symex" xmlns:wpg="http://schemas.microsoft.com/office/word/2010/wordprocessingGroup" xmlns:wpi="http://schemas.microsoft.com/office/word/2010/wordprocessingInk" xmlns:wne="http://schemas.microsoft.com/office/word/2006/wordml" xmlns:wps="http://schemas.microsoft.com/office/word/2010/wordprocessingShape" mc:Ignorable="w14 w15 w16se w16cid w16 w16cex w16sdtdh w16sdtfl cr w16du wp14">
+<w16cex:commentsExtensible xmlns:wpc="http://schemas.microsoft.com/office/word/2010/wordprocessingCanvas" xmlns:cx="http://schemas.microsoft.com/office/drawing/2014/chartex" xmlns:cx1="http://schemas.microsoft.com/office/drawing/2015/9/8/chartex" xmlns:cx2="http://schemas.microsoft.com/office/drawing/2015/10/21/chartex" xmlns:cx3="http://schemas.microsoft.com/office/drawing/2016/5/9/chartex" xmlns:cx4="http://schemas.microsoft.com/office/drawing/2016/5/10/chartex" xmlns:cx5="http://schemas.microsoft.com/office/drawing/2016/5/11/chartex" xmlns:cx6="http://schemas.microsoft.com/office/drawing/2016/5/12/chartex" xmlns:cx7="http://schemas.microsoft.com/office/drawing/2016/5/13/chartex" xmlns:cx8="http://schemas.microsoft.com/office/drawing/2016/5/14/chartex" xmlns:mc="http://schemas.openxmlformats.org/markup-compatibility/2006" xmlns:aink="http://schemas.microsoft.com/office/drawing/2016/ink" xmlns:am3d="http://schemas.microsoft.com/office/drawing/2017/model3d" xmlns:o="urn:schemas-microsoft-com:office:office" xmlns:oel="http://schemas.microsoft.com/office/2019/extlst" xmlns:r="http://schemas.openxmlformats.org/officeDocument/2006/relationships" xmlns:m="http://schemas.openxmlformats.org/officeDocument/2006/math" xmlns:v="urn:schemas-microsoft-com:vml" xmlns:wp14="http://schemas.microsoft.com/office/word/2010/wordprocessingDrawing" xmlns:wp="http://schemas.openxmlformats.org/drawingml/2006/wordprocessingDrawing" xmlns:w10="urn:schemas-microsoft-com:office:word" xmlns:w="http://schemas.openxmlformats.org/wordprocessingml/2006/main" xmlns:w14="http://schemas.microsoft.com/office/word/2010/wordml" xmlns:w15="http://schemas.microsoft.com/office/word/2012/wordml" xmlns:w16cex="http://schemas.microsoft.com/office/word/2018/wordml/cex" xmlns:w16cid="http://schemas.microsoft.com/office/word/2016/wordml/cid" xmlns:w16="http://schemas.microsoft.com/office/word/2018/wordml" xmlns:w16sdtdh="http://schemas.microsoft.com/office/word/2020/wordml/sdtdatahash" xmlns:w16se="http://schemas.microsoft.com/office/word/2015/wordml/symex" xmlns:wpg="http://schemas.microsoft.com/office/word/2010/wordprocessingGroup" xmlns:wpi="http://schemas.microsoft.com/office/word/2010/wordprocessingInk" xmlns:wne="http://schemas.microsoft.com/office/word/2006/wordml" xmlns:wps="http://schemas.microsoft.com/office/word/2010/wordprocessingShape" mc:Ignorable="w14 w15 w16se w16cid w16 w16cex w16sdtdh wp14">
   <w16cex:commentExtensible w16cex:durableId="218E0726" w16cex:dateUtc="2024-12-23T15:39:00Z"/>
   <w16cex:commentExtensible w16cex:durableId="6633EED1" w16cex:dateUtc="2024-12-23T15:42:00Z"/>
   <w16cex:commentExtensible w16cex:durableId="2B1415D4" w16cex:dateUtc="2024-12-23T16:01:00Z"/>
@@ -1578,7 +1504,7 @@
 </file>
 
 <file path=word/commentsIds.xml><?xml version="1.0" encoding="utf-8"?>
-<w16cid:commentsIds xmlns:wpc="http://schemas.microsoft.com/office/word/2010/wordprocessingCanvas" xmlns:cx="http://schemas.microsoft.com/office/drawing/2014/chartex" xmlns:cx1="http://schemas.microsoft.com/office/drawing/2015/9/8/chartex" xmlns:cx2="http://schemas.microsoft.com/office/drawing/2015/10/21/chartex" xmlns:cx3="http://schemas.microsoft.com/office/drawing/2016/5/9/chartex" xmlns:cx4="http://schemas.microsoft.com/office/drawing/2016/5/10/chartex" xmlns:cx5="http://schemas.microsoft.com/office/drawing/2016/5/11/chartex" xmlns:cx6="http://schemas.microsoft.com/office/drawing/2016/5/12/chartex" xmlns:cx7="http://schemas.microsoft.com/office/drawing/2016/5/13/chartex" xmlns:cx8="http://schemas.microsoft.com/office/drawing/2016/5/14/chartex" xmlns:mc="http://schemas.openxmlformats.org/markup-compatibility/2006" xmlns:aink="http://schemas.microsoft.com/office/drawing/2016/ink" xmlns:am3d="http://schemas.microsoft.com/office/drawing/2017/model3d" xmlns:o="urn:schemas-microsoft-com:office:office" xmlns:oel="http://schemas.microsoft.com/office/2019/extlst" xmlns:r="http://schemas.openxmlformats.org/officeDocument/2006/relationships" xmlns:m="http://schemas.openxmlformats.org/officeDocument/2006/math" xmlns:v="urn:schemas-microsoft-com:vml" xmlns:wp14="http://schemas.microsoft.com/office/word/2010/wordprocessingDrawing" xmlns:wp="http://schemas.openxmlformats.org/drawingml/2006/wordprocessingDrawing" xmlns:w10="urn:schemas-microsoft-com:office:word" xmlns:w="http://schemas.openxmlformats.org/wordprocessingml/2006/main" xmlns:w14="http://schemas.microsoft.com/office/word/2010/wordml" xmlns:w15="http://schemas.microsoft.com/office/word/2012/wordml" xmlns:w16cex="http://schemas.microsoft.com/office/word/2018/wordml/cex" xmlns:w16cid="http://schemas.microsoft.com/office/word/2016/wordml/cid" xmlns:w16="http://schemas.microsoft.com/office/word/2018/wordml" xmlns:w16du="http://schemas.microsoft.com/office/word/2023/wordml/word16du" xmlns:w16sdtdh="http://schemas.microsoft.com/office/word/2020/wordml/sdtdatahash" xmlns:w16sdtfl="http://schemas.microsoft.com/office/word/2024/wordml/sdtformatlock" xmlns:w16se="http://schemas.microsoft.com/office/word/2015/wordml/symex" xmlns:wpg="http://schemas.microsoft.com/office/word/2010/wordprocessingGroup" xmlns:wpi="http://schemas.microsoft.com/office/word/2010/wordprocessingInk" xmlns:wne="http://schemas.microsoft.com/office/word/2006/wordml" xmlns:wps="http://schemas.microsoft.com/office/word/2010/wordprocessingShape" mc:Ignorable="w14 w15 w16se w16cid w16 w16cex w16sdtdh w16sdtfl w16du wp14">
+<w16cid:commentsIds xmlns:wpc="http://schemas.microsoft.com/office/word/2010/wordprocessingCanvas" xmlns:cx="http://schemas.microsoft.com/office/drawing/2014/chartex" xmlns:cx1="http://schemas.microsoft.com/office/drawing/2015/9/8/chartex" xmlns:cx2="http://schemas.microsoft.com/office/drawing/2015/10/21/chartex" xmlns:cx3="http://schemas.microsoft.com/office/drawing/2016/5/9/chartex" xmlns:cx4="http://schemas.microsoft.com/office/drawing/2016/5/10/chartex" xmlns:cx5="http://schemas.microsoft.com/office/drawing/2016/5/11/chartex" xmlns:cx6="http://schemas.microsoft.com/office/drawing/2016/5/12/chartex" xmlns:cx7="http://schemas.microsoft.com/office/drawing/2016/5/13/chartex" xmlns:cx8="http://schemas.microsoft.com/office/drawing/2016/5/14/chartex" xmlns:mc="http://schemas.openxmlformats.org/markup-compatibility/2006" xmlns:aink="http://schemas.microsoft.com/office/drawing/2016/ink" xmlns:am3d="http://schemas.microsoft.com/office/drawing/2017/model3d" xmlns:o="urn:schemas-microsoft-com:office:office" xmlns:oel="http://schemas.microsoft.com/office/2019/extlst" xmlns:r="http://schemas.openxmlformats.org/officeDocument/2006/relationships" xmlns:m="http://schemas.openxmlformats.org/officeDocument/2006/math" xmlns:v="urn:schemas-microsoft-com:vml" xmlns:wp14="http://schemas.microsoft.com/office/word/2010/wordprocessingDrawing" xmlns:wp="http://schemas.openxmlformats.org/drawingml/2006/wordprocessingDrawing" xmlns:w10="urn:schemas-microsoft-com:office:word" xmlns:w="http://schemas.openxmlformats.org/wordprocessingml/2006/main" xmlns:w14="http://schemas.microsoft.com/office/word/2010/wordml" xmlns:w15="http://schemas.microsoft.com/office/word/2012/wordml" xmlns:w16cex="http://schemas.microsoft.com/office/word/2018/wordml/cex" xmlns:w16cid="http://schemas.microsoft.com/office/word/2016/wordml/cid" xmlns:w16="http://schemas.microsoft.com/office/word/2018/wordml" xmlns:w16sdtdh="http://schemas.microsoft.com/office/word/2020/wordml/sdtdatahash" xmlns:w16se="http://schemas.microsoft.com/office/word/2015/wordml/symex" xmlns:wpg="http://schemas.microsoft.com/office/word/2010/wordprocessingGroup" xmlns:wpi="http://schemas.microsoft.com/office/word/2010/wordprocessingInk" xmlns:wne="http://schemas.microsoft.com/office/word/2006/wordml" xmlns:wps="http://schemas.microsoft.com/office/word/2010/wordprocessingShape" mc:Ignorable="w14 w15 w16se w16cid w16 w16cex w16sdtdh wp14">
   <w16cid:commentId w16cid:paraId="034318FB" w16cid:durableId="218E0726"/>
   <w16cid:commentId w16cid:paraId="75037570" w16cid:durableId="6633EED1"/>
   <w16cid:commentId w16cid:paraId="1340C9E6" w16cid:durableId="2B1415D4"/>
@@ -1593,7 +1519,7 @@
 </file>
 
 <file path=word/numbering.xml><?xml version="1.0" encoding="utf-8"?>
-<w:numbering xmlns:wpc="http://schemas.microsoft.com/office/word/2010/wordprocessingCanvas" xmlns:cx="http://schemas.microsoft.com/office/drawing/2014/chartex" xmlns:cx1="http://schemas.microsoft.com/office/drawing/2015/9/8/chartex" xmlns:cx2="http://schemas.microsoft.com/office/drawing/2015/10/21/chartex" xmlns:cx3="http://schemas.microsoft.com/office/drawing/2016/5/9/chartex" xmlns:cx4="http://schemas.microsoft.com/office/drawing/2016/5/10/chartex" xmlns:cx5="http://schemas.microsoft.com/office/drawing/2016/5/11/chartex" xmlns:cx6="http://schemas.microsoft.com/office/drawing/2016/5/12/chartex" xmlns:cx7="http://schemas.microsoft.com/office/drawing/2016/5/13/chartex" xmlns:cx8="http://schemas.microsoft.com/office/drawing/2016/5/14/chartex" xmlns:mc="http://schemas.openxmlformats.org/markup-compatibility/2006" xmlns:aink="http://schemas.microsoft.com/office/drawing/2016/ink" xmlns:am3d="http://schemas.microsoft.com/office/drawing/2017/model3d" xmlns:o="urn:schemas-microsoft-com:office:office" xmlns:oel="http://schemas.microsoft.com/office/2019/extlst" xmlns:r="http://schemas.openxmlformats.org/officeDocument/2006/relationships" xmlns:m="http://schemas.openxmlformats.org/officeDocument/2006/math" xmlns:v="urn:schemas-microsoft-com:vml" xmlns:wp14="http://schemas.microsoft.com/office/word/2010/wordprocessingDrawing" xmlns:wp="http://schemas.openxmlformats.org/drawingml/2006/wordprocessingDrawing" xmlns:w10="urn:schemas-microsoft-com:office:word" xmlns:w="http://schemas.openxmlformats.org/wordprocessingml/2006/main" xmlns:w14="http://schemas.microsoft.com/office/word/2010/wordml" xmlns:w15="http://schemas.microsoft.com/office/word/2012/wordml" xmlns:w16cex="http://schemas.microsoft.com/office/word/2018/wordml/cex" xmlns:w16cid="http://schemas.microsoft.com/office/word/2016/wordml/cid" xmlns:w16="http://schemas.microsoft.com/office/word/2018/wordml" xmlns:w16du="http://schemas.microsoft.com/office/word/2023/wordml/word16du" xmlns:w16sdtdh="http://schemas.microsoft.com/office/word/2020/wordml/sdtdatahash" xmlns:w16sdtfl="http://schemas.microsoft.com/office/word/2024/wordml/sdtformatlock" xmlns:w16se="http://schemas.microsoft.com/office/word/2015/wordml/symex" xmlns:wpg="http://schemas.microsoft.com/office/word/2010/wordprocessingGroup" xmlns:wpi="http://schemas.microsoft.com/office/word/2010/wordprocessingInk" xmlns:wne="http://schemas.microsoft.com/office/word/2006/wordml" xmlns:wps="http://schemas.microsoft.com/office/word/2010/wordprocessingShape" mc:Ignorable="w14 w15 w16se w16cid w16 w16cex w16sdtdh w16sdtfl w16du wp14">
+<w:numbering xmlns:wpc="http://schemas.microsoft.com/office/word/2010/wordprocessingCanvas" xmlns:cx="http://schemas.microsoft.com/office/drawing/2014/chartex" xmlns:cx1="http://schemas.microsoft.com/office/drawing/2015/9/8/chartex" xmlns:cx2="http://schemas.microsoft.com/office/drawing/2015/10/21/chartex" xmlns:cx3="http://schemas.microsoft.com/office/drawing/2016/5/9/chartex" xmlns:cx4="http://schemas.microsoft.com/office/drawing/2016/5/10/chartex" xmlns:cx5="http://schemas.microsoft.com/office/drawing/2016/5/11/chartex" xmlns:cx6="http://schemas.microsoft.com/office/drawing/2016/5/12/chartex" xmlns:cx7="http://schemas.microsoft.com/office/drawing/2016/5/13/chartex" xmlns:cx8="http://schemas.microsoft.com/office/drawing/2016/5/14/chartex" xmlns:mc="http://schemas.openxmlformats.org/markup-compatibility/2006" xmlns:aink="http://schemas.microsoft.com/office/drawing/2016/ink" xmlns:am3d="http://schemas.microsoft.com/office/drawing/2017/model3d" xmlns:o="urn:schemas-microsoft-com:office:office" xmlns:oel="http://schemas.microsoft.com/office/2019/extlst" xmlns:r="http://schemas.openxmlformats.org/officeDocument/2006/relationships" xmlns:m="http://schemas.openxmlformats.org/officeDocument/2006/math" xmlns:v="urn:schemas-microsoft-com:vml" xmlns:wp14="http://schemas.microsoft.com/office/word/2010/wordprocessingDrawing" xmlns:wp="http://schemas.openxmlformats.org/drawingml/2006/wordprocessingDrawing" xmlns:w10="urn:schemas-microsoft-com:office:word" xmlns:w="http://schemas.openxmlformats.org/wordprocessingml/2006/main" xmlns:w14="http://schemas.microsoft.com/office/word/2010/wordml" xmlns:w15="http://schemas.microsoft.com/office/word/2012/wordml" xmlns:w16cex="http://schemas.microsoft.com/office/word/2018/wordml/cex" xmlns:w16cid="http://schemas.microsoft.com/office/word/2016/wordml/cid" xmlns:w16="http://schemas.microsoft.com/office/word/2018/wordml" xmlns:w16sdtdh="http://schemas.microsoft.com/office/word/2020/wordml/sdtdatahash" xmlns:w16se="http://schemas.microsoft.com/office/word/2015/wordml/symex" xmlns:wpg="http://schemas.microsoft.com/office/word/2010/wordprocessingGroup" xmlns:wpi="http://schemas.microsoft.com/office/word/2010/wordprocessingInk" xmlns:wne="http://schemas.microsoft.com/office/word/2006/wordml" xmlns:wps="http://schemas.microsoft.com/office/word/2010/wordprocessingShape" mc:Ignorable="w14 w15 w16se w16cid w16 w16cex w16sdtdh wp14">
   <w:abstractNum w:abstractNumId="0" w15:restartNumberingAfterBreak="0">
     <w:nsid w:val="025CF5B5"/>
     <w:multiLevelType w:val="hybridMultilevel"/>
@@ -5169,7 +5095,7 @@
 </file>
 
 <file path=word/people.xml><?xml version="1.0" encoding="utf-8"?>
-<w15:people xmlns:wpc="http://schemas.microsoft.com/office/word/2010/wordprocessingCanvas" xmlns:cx="http://schemas.microsoft.com/office/drawing/2014/chartex" xmlns:cx1="http://schemas.microsoft.com/office/drawing/2015/9/8/chartex" xmlns:cx2="http://schemas.microsoft.com/office/drawing/2015/10/21/chartex" xmlns:cx3="http://schemas.microsoft.com/office/drawing/2016/5/9/chartex" xmlns:cx4="http://schemas.microsoft.com/office/drawing/2016/5/10/chartex" xmlns:cx5="http://schemas.microsoft.com/office/drawing/2016/5/11/chartex" xmlns:cx6="http://schemas.microsoft.com/office/drawing/2016/5/12/chartex" xmlns:cx7="http://schemas.microsoft.com/office/drawing/2016/5/13/chartex" xmlns:cx8="http://schemas.microsoft.com/office/drawing/2016/5/14/chartex" xmlns:mc="http://schemas.openxmlformats.org/markup-compatibility/2006" xmlns:aink="http://schemas.microsoft.com/office/drawing/2016/ink" xmlns:am3d="http://schemas.microsoft.com/office/drawing/2017/model3d" xmlns:o="urn:schemas-microsoft-com:office:office" xmlns:oel="http://schemas.microsoft.com/office/2019/extlst" xmlns:r="http://schemas.openxmlformats.org/officeDocument/2006/relationships" xmlns:m="http://schemas.openxmlformats.org/officeDocument/2006/math" xmlns:v="urn:schemas-microsoft-com:vml" xmlns:wp14="http://schemas.microsoft.com/office/word/2010/wordprocessingDrawing" xmlns:wp="http://schemas.openxmlformats.org/drawingml/2006/wordprocessingDrawing" xmlns:w10="urn:schemas-microsoft-com:office:word" xmlns:w="http://schemas.openxmlformats.org/wordprocessingml/2006/main" xmlns:w14="http://schemas.microsoft.com/office/word/2010/wordml" xmlns:w15="http://schemas.microsoft.com/office/word/2012/wordml" xmlns:w16cex="http://schemas.microsoft.com/office/word/2018/wordml/cex" xmlns:w16cid="http://schemas.microsoft.com/office/word/2016/wordml/cid" xmlns:w16="http://schemas.microsoft.com/office/word/2018/wordml" xmlns:w16du="http://schemas.microsoft.com/office/word/2023/wordml/word16du" xmlns:w16sdtdh="http://schemas.microsoft.com/office/word/2020/wordml/sdtdatahash" xmlns:w16sdtfl="http://schemas.microsoft.com/office/word/2024/wordml/sdtformatlock" xmlns:w16se="http://schemas.microsoft.com/office/word/2015/wordml/symex" xmlns:wpg="http://schemas.microsoft.com/office/word/2010/wordprocessingGroup" xmlns:wpi="http://schemas.microsoft.com/office/word/2010/wordprocessingInk" xmlns:wne="http://schemas.microsoft.com/office/word/2006/wordml" xmlns:wps="http://schemas.microsoft.com/office/word/2010/wordprocessingShape" mc:Ignorable="w14 w15 w16se w16cid w16 w16cex w16sdtdh w16sdtfl w16du wp14">
+<w15:people xmlns:wpc="http://schemas.microsoft.com/office/word/2010/wordprocessingCanvas" xmlns:cx="http://schemas.microsoft.com/office/drawing/2014/chartex" xmlns:cx1="http://schemas.microsoft.com/office/drawing/2015/9/8/chartex" xmlns:cx2="http://schemas.microsoft.com/office/drawing/2015/10/21/chartex" xmlns:cx3="http://schemas.microsoft.com/office/drawing/2016/5/9/chartex" xmlns:cx4="http://schemas.microsoft.com/office/drawing/2016/5/10/chartex" xmlns:cx5="http://schemas.microsoft.com/office/drawing/2016/5/11/chartex" xmlns:cx6="http://schemas.microsoft.com/office/drawing/2016/5/12/chartex" xmlns:cx7="http://schemas.microsoft.com/office/drawing/2016/5/13/chartex" xmlns:cx8="http://schemas.microsoft.com/office/drawing/2016/5/14/chartex" xmlns:mc="http://schemas.openxmlformats.org/markup-compatibility/2006" xmlns:aink="http://schemas.microsoft.com/office/drawing/2016/ink" xmlns:am3d="http://schemas.microsoft.com/office/drawing/2017/model3d" xmlns:o="urn:schemas-microsoft-com:office:office" xmlns:oel="http://schemas.microsoft.com/office/2019/extlst" xmlns:r="http://schemas.openxmlformats.org/officeDocument/2006/relationships" xmlns:m="http://schemas.openxmlformats.org/officeDocument/2006/math" xmlns:v="urn:schemas-microsoft-com:vml" xmlns:wp14="http://schemas.microsoft.com/office/word/2010/wordprocessingDrawing" xmlns:wp="http://schemas.openxmlformats.org/drawingml/2006/wordprocessingDrawing" xmlns:w10="urn:schemas-microsoft-com:office:word" xmlns:w="http://schemas.openxmlformats.org/wordprocessingml/2006/main" xmlns:w14="http://schemas.microsoft.com/office/word/2010/wordml" xmlns:w15="http://schemas.microsoft.com/office/word/2012/wordml" xmlns:w16cex="http://schemas.microsoft.com/office/word/2018/wordml/cex" xmlns:w16cid="http://schemas.microsoft.com/office/word/2016/wordml/cid" xmlns:w16="http://schemas.microsoft.com/office/word/2018/wordml" xmlns:w16sdtdh="http://schemas.microsoft.com/office/word/2020/wordml/sdtdatahash" xmlns:w16se="http://schemas.microsoft.com/office/word/2015/wordml/symex" xmlns:wpg="http://schemas.microsoft.com/office/word/2010/wordprocessingGroup" xmlns:wpi="http://schemas.microsoft.com/office/word/2010/wordprocessingInk" xmlns:wne="http://schemas.microsoft.com/office/word/2006/wordml" xmlns:wps="http://schemas.microsoft.com/office/word/2010/wordprocessingShape" mc:Ignorable="w14 w15 w16se w16cid w16 w16cex w16sdtdh wp14">
   <w15:person w15:author="f.tentori4@campus.unimib.it">
     <w15:presenceInfo w15:providerId="AD" w15:userId="S::f.tentori4@campus.unimib.it::d44885af-1cfc-4c31-b9f5-78e6dea907b5"/>
   </w15:person>
@@ -5180,7 +5106,7 @@
 </file>
 
 <file path=word/styles.xml><?xml version="1.0" encoding="utf-8"?>
-<w:styles xmlns:mc="http://schemas.openxmlformats.org/markup-compatibility/2006" xmlns:r="http://schemas.openxmlformats.org/officeDocument/2006/relationships" xmlns:w="http://schemas.openxmlformats.org/wordprocessingml/2006/main" xmlns:w14="http://schemas.microsoft.com/office/word/2010/wordml" xmlns:w15="http://schemas.microsoft.com/office/word/2012/wordml" xmlns:w16cex="http://schemas.microsoft.com/office/word/2018/wordml/cex" xmlns:w16cid="http://schemas.microsoft.com/office/word/2016/wordml/cid" xmlns:w16="http://schemas.microsoft.com/office/word/2018/wordml" xmlns:w16du="http://schemas.microsoft.com/office/word/2023/wordml/word16du" xmlns:w16sdtdh="http://schemas.microsoft.com/office/word/2020/wordml/sdtdatahash" xmlns:w16sdtfl="http://schemas.microsoft.com/office/word/2024/wordml/sdtformatlock" xmlns:w16se="http://schemas.microsoft.com/office/word/2015/wordml/symex" mc:Ignorable="w14 w15 w16se w16cid w16 w16cex w16sdtdh w16sdtfl w16du">
+<w:styles xmlns:mc="http://schemas.openxmlformats.org/markup-compatibility/2006" xmlns:r="http://schemas.openxmlformats.org/officeDocument/2006/relationships" xmlns:w="http://schemas.openxmlformats.org/wordprocessingml/2006/main" xmlns:w14="http://schemas.microsoft.com/office/word/2010/wordml" xmlns:w15="http://schemas.microsoft.com/office/word/2012/wordml" xmlns:w16cex="http://schemas.microsoft.com/office/word/2018/wordml/cex" xmlns:w16cid="http://schemas.microsoft.com/office/word/2016/wordml/cid" xmlns:w16="http://schemas.microsoft.com/office/word/2018/wordml" xmlns:w16sdtdh="http://schemas.microsoft.com/office/word/2020/wordml/sdtdatahash" xmlns:w16se="http://schemas.microsoft.com/office/word/2015/wordml/symex" mc:Ignorable="w14 w15 w16se w16cid w16 w16cex w16sdtdh">
   <w:docDefaults>
     <w:rPrDefault>
       <w:rPr>
@@ -5576,16 +5502,16 @@
     <w:lsdException w:name="Unresolved Mention" w:semiHidden="1" w:unhideWhenUsed="1"/>
     <w:lsdException w:name="Smart Link" w:semiHidden="1" w:unhideWhenUsed="1"/>
   </w:latentStyles>
-  <w:style w:type="paragraph" w:default="1" w:styleId="Normale">
+  <w:style w:type="paragraph" w:default="1" w:styleId="Normal">
     <w:name w:val="Normal"/>
     <w:qFormat/>
     <w:rsid w:val="000D0952"/>
   </w:style>
-  <w:style w:type="paragraph" w:styleId="Titolo1">
+  <w:style w:type="paragraph" w:styleId="Heading1">
     <w:name w:val="heading 1"/>
-    <w:basedOn w:val="Normale"/>
-    <w:next w:val="Normale"/>
-    <w:link w:val="Titolo1Carattere"/>
+    <w:basedOn w:val="Normal"/>
+    <w:next w:val="Normal"/>
+    <w:link w:val="Heading1Char"/>
     <w:uiPriority w:val="9"/>
     <w:qFormat/>
     <w:rsid w:val="000F69B2"/>
@@ -5602,11 +5528,11 @@
       <w:szCs w:val="40"/>
     </w:rPr>
   </w:style>
-  <w:style w:type="paragraph" w:styleId="Titolo2">
+  <w:style w:type="paragraph" w:styleId="Heading2">
     <w:name w:val="heading 2"/>
-    <w:basedOn w:val="Normale"/>
-    <w:next w:val="Normale"/>
-    <w:link w:val="Titolo2Carattere"/>
+    <w:basedOn w:val="Normal"/>
+    <w:next w:val="Normal"/>
+    <w:link w:val="Heading2Char"/>
     <w:uiPriority w:val="9"/>
     <w:unhideWhenUsed/>
     <w:qFormat/>
@@ -5624,11 +5550,11 @@
       <w:szCs w:val="32"/>
     </w:rPr>
   </w:style>
-  <w:style w:type="paragraph" w:styleId="Titolo3">
+  <w:style w:type="paragraph" w:styleId="Heading3">
     <w:name w:val="heading 3"/>
-    <w:basedOn w:val="Normale"/>
-    <w:next w:val="Normale"/>
-    <w:link w:val="Titolo3Carattere"/>
+    <w:basedOn w:val="Normal"/>
+    <w:next w:val="Normal"/>
+    <w:link w:val="Heading3Char"/>
     <w:uiPriority w:val="9"/>
     <w:semiHidden/>
     <w:unhideWhenUsed/>
@@ -5647,11 +5573,11 @@
       <w:szCs w:val="28"/>
     </w:rPr>
   </w:style>
-  <w:style w:type="paragraph" w:styleId="Titolo4">
+  <w:style w:type="paragraph" w:styleId="Heading4">
     <w:name w:val="heading 4"/>
-    <w:basedOn w:val="Normale"/>
-    <w:next w:val="Normale"/>
-    <w:link w:val="Titolo4Carattere"/>
+    <w:basedOn w:val="Normal"/>
+    <w:next w:val="Normal"/>
+    <w:link w:val="Heading4Char"/>
     <w:uiPriority w:val="9"/>
     <w:semiHidden/>
     <w:unhideWhenUsed/>
@@ -5670,11 +5596,11 @@
       <w:color w:val="365F91" w:themeColor="accent1" w:themeShade="BF"/>
     </w:rPr>
   </w:style>
-  <w:style w:type="paragraph" w:styleId="Titolo5">
+  <w:style w:type="paragraph" w:styleId="Heading5">
     <w:name w:val="heading 5"/>
-    <w:basedOn w:val="Normale"/>
-    <w:next w:val="Normale"/>
-    <w:link w:val="Titolo5Carattere"/>
+    <w:basedOn w:val="Normal"/>
+    <w:next w:val="Normal"/>
+    <w:link w:val="Heading5Char"/>
     <w:uiPriority w:val="9"/>
     <w:semiHidden/>
     <w:unhideWhenUsed/>
@@ -5691,11 +5617,11 @@
       <w:color w:val="365F91" w:themeColor="accent1" w:themeShade="BF"/>
     </w:rPr>
   </w:style>
-  <w:style w:type="paragraph" w:styleId="Titolo6">
+  <w:style w:type="paragraph" w:styleId="Heading6">
     <w:name w:val="heading 6"/>
-    <w:basedOn w:val="Normale"/>
-    <w:next w:val="Normale"/>
-    <w:link w:val="Titolo6Carattere"/>
+    <w:basedOn w:val="Normal"/>
+    <w:next w:val="Normal"/>
+    <w:link w:val="Heading6Char"/>
     <w:uiPriority w:val="9"/>
     <w:semiHidden/>
     <w:unhideWhenUsed/>
@@ -5714,11 +5640,11 @@
       <w:color w:val="595959" w:themeColor="text1" w:themeTint="A6"/>
     </w:rPr>
   </w:style>
-  <w:style w:type="paragraph" w:styleId="Titolo7">
+  <w:style w:type="paragraph" w:styleId="Heading7">
     <w:name w:val="heading 7"/>
-    <w:basedOn w:val="Normale"/>
-    <w:next w:val="Normale"/>
-    <w:link w:val="Titolo7Carattere"/>
+    <w:basedOn w:val="Normal"/>
+    <w:next w:val="Normal"/>
+    <w:link w:val="Heading7Char"/>
     <w:uiPriority w:val="9"/>
     <w:semiHidden/>
     <w:unhideWhenUsed/>
@@ -5735,11 +5661,11 @@
       <w:color w:val="595959" w:themeColor="text1" w:themeTint="A6"/>
     </w:rPr>
   </w:style>
-  <w:style w:type="paragraph" w:styleId="Titolo8">
+  <w:style w:type="paragraph" w:styleId="Heading8">
     <w:name w:val="heading 8"/>
-    <w:basedOn w:val="Normale"/>
-    <w:next w:val="Normale"/>
-    <w:link w:val="Titolo8Carattere"/>
+    <w:basedOn w:val="Normal"/>
+    <w:next w:val="Normal"/>
+    <w:link w:val="Heading8Char"/>
     <w:uiPriority w:val="9"/>
     <w:semiHidden/>
     <w:unhideWhenUsed/>
@@ -5758,11 +5684,11 @@
       <w:color w:val="272727" w:themeColor="text1" w:themeTint="D8"/>
     </w:rPr>
   </w:style>
-  <w:style w:type="paragraph" w:styleId="Titolo9">
+  <w:style w:type="paragraph" w:styleId="Heading9">
     <w:name w:val="heading 9"/>
-    <w:basedOn w:val="Normale"/>
-    <w:next w:val="Normale"/>
-    <w:link w:val="Titolo9Carattere"/>
+    <w:basedOn w:val="Normal"/>
+    <w:next w:val="Normal"/>
+    <w:link w:val="Heading9Char"/>
     <w:uiPriority w:val="9"/>
     <w:semiHidden/>
     <w:unhideWhenUsed/>
@@ -5779,13 +5705,13 @@
       <w:color w:val="272727" w:themeColor="text1" w:themeTint="D8"/>
     </w:rPr>
   </w:style>
-  <w:style w:type="character" w:default="1" w:styleId="Carpredefinitoparagrafo">
+  <w:style w:type="character" w:default="1" w:styleId="DefaultParagraphFont">
     <w:name w:val="Default Paragraph Font"/>
     <w:uiPriority w:val="1"/>
     <w:semiHidden/>
     <w:unhideWhenUsed/>
   </w:style>
-  <w:style w:type="table" w:default="1" w:styleId="Tabellanormale">
+  <w:style w:type="table" w:default="1" w:styleId="TableNormal">
     <w:name w:val="Normal Table"/>
     <w:uiPriority w:val="99"/>
     <w:semiHidden/>
@@ -5800,16 +5726,16 @@
       </w:tblCellMar>
     </w:tblPr>
   </w:style>
-  <w:style w:type="numbering" w:default="1" w:styleId="Nessunelenco">
+  <w:style w:type="numbering" w:default="1" w:styleId="NoList">
     <w:name w:val="No List"/>
     <w:uiPriority w:val="99"/>
     <w:semiHidden/>
     <w:unhideWhenUsed/>
   </w:style>
-  <w:style w:type="character" w:customStyle="1" w:styleId="Titolo1Carattere">
-    <w:name w:val="Titolo 1 Carattere"/>
-    <w:basedOn w:val="Carpredefinitoparagrafo"/>
-    <w:link w:val="Titolo1"/>
+  <w:style w:type="character" w:customStyle="1" w:styleId="Heading1Char">
+    <w:name w:val="Heading 1 Char"/>
+    <w:basedOn w:val="DefaultParagraphFont"/>
+    <w:link w:val="Heading1"/>
     <w:uiPriority w:val="9"/>
     <w:rsid w:val="000F69B2"/>
     <w:rPr>
@@ -5819,10 +5745,10 @@
       <w:szCs w:val="40"/>
     </w:rPr>
   </w:style>
-  <w:style w:type="character" w:customStyle="1" w:styleId="Titolo2Carattere">
-    <w:name w:val="Titolo 2 Carattere"/>
-    <w:basedOn w:val="Carpredefinitoparagrafo"/>
-    <w:link w:val="Titolo2"/>
+  <w:style w:type="character" w:customStyle="1" w:styleId="Heading2Char">
+    <w:name w:val="Heading 2 Char"/>
+    <w:basedOn w:val="DefaultParagraphFont"/>
+    <w:link w:val="Heading2"/>
     <w:uiPriority w:val="9"/>
     <w:rsid w:val="000F69B2"/>
     <w:rPr>
@@ -5832,10 +5758,10 @@
       <w:szCs w:val="32"/>
     </w:rPr>
   </w:style>
-  <w:style w:type="character" w:customStyle="1" w:styleId="Titolo3Carattere">
-    <w:name w:val="Titolo 3 Carattere"/>
-    <w:basedOn w:val="Carpredefinitoparagrafo"/>
-    <w:link w:val="Titolo3"/>
+  <w:style w:type="character" w:customStyle="1" w:styleId="Heading3Char">
+    <w:name w:val="Heading 3 Char"/>
+    <w:basedOn w:val="DefaultParagraphFont"/>
+    <w:link w:val="Heading3"/>
     <w:uiPriority w:val="9"/>
     <w:semiHidden/>
     <w:rsid w:val="000F69B2"/>
@@ -5846,10 +5772,10 @@
       <w:szCs w:val="28"/>
     </w:rPr>
   </w:style>
-  <w:style w:type="character" w:customStyle="1" w:styleId="Titolo4Carattere">
-    <w:name w:val="Titolo 4 Carattere"/>
-    <w:basedOn w:val="Carpredefinitoparagrafo"/>
-    <w:link w:val="Titolo4"/>
+  <w:style w:type="character" w:customStyle="1" w:styleId="Heading4Char">
+    <w:name w:val="Heading 4 Char"/>
+    <w:basedOn w:val="DefaultParagraphFont"/>
+    <w:link w:val="Heading4"/>
     <w:uiPriority w:val="9"/>
     <w:semiHidden/>
     <w:rsid w:val="000F69B2"/>
@@ -5860,10 +5786,10 @@
       <w:color w:val="365F91" w:themeColor="accent1" w:themeShade="BF"/>
     </w:rPr>
   </w:style>
-  <w:style w:type="character" w:customStyle="1" w:styleId="Titolo5Carattere">
-    <w:name w:val="Titolo 5 Carattere"/>
-    <w:basedOn w:val="Carpredefinitoparagrafo"/>
-    <w:link w:val="Titolo5"/>
+  <w:style w:type="character" w:customStyle="1" w:styleId="Heading5Char">
+    <w:name w:val="Heading 5 Char"/>
+    <w:basedOn w:val="DefaultParagraphFont"/>
+    <w:link w:val="Heading5"/>
     <w:uiPriority w:val="9"/>
     <w:semiHidden/>
     <w:rsid w:val="000F69B2"/>
@@ -5872,10 +5798,10 @@
       <w:color w:val="365F91" w:themeColor="accent1" w:themeShade="BF"/>
     </w:rPr>
   </w:style>
-  <w:style w:type="character" w:customStyle="1" w:styleId="Titolo6Carattere">
-    <w:name w:val="Titolo 6 Carattere"/>
-    <w:basedOn w:val="Carpredefinitoparagrafo"/>
-    <w:link w:val="Titolo6"/>
+  <w:style w:type="character" w:customStyle="1" w:styleId="Heading6Char">
+    <w:name w:val="Heading 6 Char"/>
+    <w:basedOn w:val="DefaultParagraphFont"/>
+    <w:link w:val="Heading6"/>
     <w:uiPriority w:val="9"/>
     <w:semiHidden/>
     <w:rsid w:val="000F69B2"/>
@@ -5886,10 +5812,10 @@
       <w:color w:val="595959" w:themeColor="text1" w:themeTint="A6"/>
     </w:rPr>
   </w:style>
-  <w:style w:type="character" w:customStyle="1" w:styleId="Titolo7Carattere">
-    <w:name w:val="Titolo 7 Carattere"/>
-    <w:basedOn w:val="Carpredefinitoparagrafo"/>
-    <w:link w:val="Titolo7"/>
+  <w:style w:type="character" w:customStyle="1" w:styleId="Heading7Char">
+    <w:name w:val="Heading 7 Char"/>
+    <w:basedOn w:val="DefaultParagraphFont"/>
+    <w:link w:val="Heading7"/>
     <w:uiPriority w:val="9"/>
     <w:semiHidden/>
     <w:rsid w:val="000F69B2"/>
@@ -5898,10 +5824,10 @@
       <w:color w:val="595959" w:themeColor="text1" w:themeTint="A6"/>
     </w:rPr>
   </w:style>
-  <w:style w:type="character" w:customStyle="1" w:styleId="Titolo8Carattere">
-    <w:name w:val="Titolo 8 Carattere"/>
-    <w:basedOn w:val="Carpredefinitoparagrafo"/>
-    <w:link w:val="Titolo8"/>
+  <w:style w:type="character" w:customStyle="1" w:styleId="Heading8Char">
+    <w:name w:val="Heading 8 Char"/>
+    <w:basedOn w:val="DefaultParagraphFont"/>
+    <w:link w:val="Heading8"/>
     <w:uiPriority w:val="9"/>
     <w:semiHidden/>
     <w:rsid w:val="000F69B2"/>
@@ -5912,10 +5838,10 @@
       <w:color w:val="272727" w:themeColor="text1" w:themeTint="D8"/>
     </w:rPr>
   </w:style>
-  <w:style w:type="character" w:customStyle="1" w:styleId="Titolo9Carattere">
-    <w:name w:val="Titolo 9 Carattere"/>
-    <w:basedOn w:val="Carpredefinitoparagrafo"/>
-    <w:link w:val="Titolo9"/>
+  <w:style w:type="character" w:customStyle="1" w:styleId="Heading9Char">
+    <w:name w:val="Heading 9 Char"/>
+    <w:basedOn w:val="DefaultParagraphFont"/>
+    <w:link w:val="Heading9"/>
     <w:uiPriority w:val="9"/>
     <w:semiHidden/>
     <w:rsid w:val="000F69B2"/>
@@ -5924,11 +5850,11 @@
       <w:color w:val="272727" w:themeColor="text1" w:themeTint="D8"/>
     </w:rPr>
   </w:style>
-  <w:style w:type="paragraph" w:styleId="Titolo">
+  <w:style w:type="paragraph" w:styleId="Title">
     <w:name w:val="Title"/>
-    <w:basedOn w:val="Normale"/>
-    <w:next w:val="Normale"/>
-    <w:link w:val="TitoloCarattere"/>
+    <w:basedOn w:val="Normal"/>
+    <w:next w:val="Normal"/>
+    <w:link w:val="TitleChar"/>
     <w:uiPriority w:val="10"/>
     <w:qFormat/>
     <w:rsid w:val="000F69B2"/>
@@ -5944,10 +5870,10 @@
       <w:szCs w:val="56"/>
     </w:rPr>
   </w:style>
-  <w:style w:type="character" w:customStyle="1" w:styleId="TitoloCarattere">
-    <w:name w:val="Titolo Carattere"/>
-    <w:basedOn w:val="Carpredefinitoparagrafo"/>
-    <w:link w:val="Titolo"/>
+  <w:style w:type="character" w:customStyle="1" w:styleId="TitleChar">
+    <w:name w:val="Title Char"/>
+    <w:basedOn w:val="DefaultParagraphFont"/>
+    <w:link w:val="Title"/>
     <w:uiPriority w:val="10"/>
     <w:rsid w:val="000F69B2"/>
     <w:rPr>
@@ -5958,11 +5884,11 @@
       <w:szCs w:val="56"/>
     </w:rPr>
   </w:style>
-  <w:style w:type="paragraph" w:styleId="Sottotitolo">
+  <w:style w:type="paragraph" w:styleId="Subtitle">
     <w:name w:val="Subtitle"/>
-    <w:basedOn w:val="Normale"/>
-    <w:next w:val="Normale"/>
-    <w:link w:val="SottotitoloCarattere"/>
+    <w:basedOn w:val="Normal"/>
+    <w:next w:val="Normal"/>
+    <w:link w:val="SubtitleChar"/>
     <w:uiPriority w:val="11"/>
     <w:qFormat/>
     <w:rsid w:val="000F69B2"/>
@@ -5980,10 +5906,10 @@
       <w:szCs w:val="28"/>
     </w:rPr>
   </w:style>
-  <w:style w:type="character" w:customStyle="1" w:styleId="SottotitoloCarattere">
-    <w:name w:val="Sottotitolo Carattere"/>
-    <w:basedOn w:val="Carpredefinitoparagrafo"/>
-    <w:link w:val="Sottotitolo"/>
+  <w:style w:type="character" w:customStyle="1" w:styleId="SubtitleChar">
+    <w:name w:val="Subtitle Char"/>
+    <w:basedOn w:val="DefaultParagraphFont"/>
+    <w:link w:val="Subtitle"/>
     <w:uiPriority w:val="11"/>
     <w:rsid w:val="000F69B2"/>
     <w:rPr>
@@ -5994,11 +5920,11 @@
       <w:szCs w:val="28"/>
     </w:rPr>
   </w:style>
-  <w:style w:type="paragraph" w:styleId="Citazione">
+  <w:style w:type="paragraph" w:styleId="Quote">
     <w:name w:val="Quote"/>
-    <w:basedOn w:val="Normale"/>
-    <w:next w:val="Normale"/>
-    <w:link w:val="CitazioneCarattere"/>
+    <w:basedOn w:val="Normal"/>
+    <w:next w:val="Normal"/>
+    <w:link w:val="QuoteChar"/>
     <w:uiPriority w:val="29"/>
     <w:qFormat/>
     <w:rsid w:val="000F69B2"/>
@@ -6012,10 +5938,10 @@
       <w:color w:val="404040" w:themeColor="text1" w:themeTint="BF"/>
     </w:rPr>
   </w:style>
-  <w:style w:type="character" w:customStyle="1" w:styleId="CitazioneCarattere">
-    <w:name w:val="Citazione Carattere"/>
-    <w:basedOn w:val="Carpredefinitoparagrafo"/>
-    <w:link w:val="Citazione"/>
+  <w:style w:type="character" w:customStyle="1" w:styleId="QuoteChar">
+    <w:name w:val="Quote Char"/>
+    <w:basedOn w:val="DefaultParagraphFont"/>
+    <w:link w:val="Quote"/>
     <w:uiPriority w:val="29"/>
     <w:rsid w:val="000F69B2"/>
     <w:rPr>
@@ -6024,9 +5950,9 @@
       <w:color w:val="404040" w:themeColor="text1" w:themeTint="BF"/>
     </w:rPr>
   </w:style>
-  <w:style w:type="paragraph" w:styleId="Paragrafoelenco">
+  <w:style w:type="paragraph" w:styleId="ListParagraph">
     <w:name w:val="List Paragraph"/>
-    <w:basedOn w:val="Normale"/>
+    <w:basedOn w:val="Normal"/>
     <w:uiPriority w:val="34"/>
     <w:qFormat/>
     <w:rsid w:val="000F69B2"/>
@@ -6035,9 +5961,9 @@
       <w:contextualSpacing/>
     </w:pPr>
   </w:style>
-  <w:style w:type="character" w:styleId="Enfasiintensa">
+  <w:style w:type="character" w:styleId="IntenseEmphasis">
     <w:name w:val="Intense Emphasis"/>
-    <w:basedOn w:val="Carpredefinitoparagrafo"/>
+    <w:basedOn w:val="DefaultParagraphFont"/>
     <w:uiPriority w:val="21"/>
     <w:qFormat/>
     <w:rsid w:val="000F69B2"/>
@@ -6047,11 +5973,11 @@
       <w:color w:val="365F91" w:themeColor="accent1" w:themeShade="BF"/>
     </w:rPr>
   </w:style>
-  <w:style w:type="paragraph" w:styleId="Citazioneintensa">
+  <w:style w:type="paragraph" w:styleId="IntenseQuote">
     <w:name w:val="Intense Quote"/>
-    <w:basedOn w:val="Normale"/>
-    <w:next w:val="Normale"/>
-    <w:link w:val="CitazioneintensaCarattere"/>
+    <w:basedOn w:val="Normal"/>
+    <w:next w:val="Normal"/>
+    <w:link w:val="IntenseQuoteChar"/>
     <w:uiPriority w:val="30"/>
     <w:qFormat/>
     <w:rsid w:val="000F69B2"/>
@@ -6070,10 +5996,10 @@
       <w:color w:val="365F91" w:themeColor="accent1" w:themeShade="BF"/>
     </w:rPr>
   </w:style>
-  <w:style w:type="character" w:customStyle="1" w:styleId="CitazioneintensaCarattere">
-    <w:name w:val="Citazione intensa Carattere"/>
-    <w:basedOn w:val="Carpredefinitoparagrafo"/>
-    <w:link w:val="Citazioneintensa"/>
+  <w:style w:type="character" w:customStyle="1" w:styleId="IntenseQuoteChar">
+    <w:name w:val="Intense Quote Char"/>
+    <w:basedOn w:val="DefaultParagraphFont"/>
+    <w:link w:val="IntenseQuote"/>
     <w:uiPriority w:val="30"/>
     <w:rsid w:val="000F69B2"/>
     <w:rPr>
@@ -6082,9 +6008,9 @@
       <w:color w:val="365F91" w:themeColor="accent1" w:themeShade="BF"/>
     </w:rPr>
   </w:style>
-  <w:style w:type="character" w:styleId="Riferimentointenso">
+  <w:style w:type="character" w:styleId="IntenseReference">
     <w:name w:val="Intense Reference"/>
-    <w:basedOn w:val="Carpredefinitoparagrafo"/>
+    <w:basedOn w:val="DefaultParagraphFont"/>
     <w:uiPriority w:val="32"/>
     <w:qFormat/>
     <w:rsid w:val="000F69B2"/>
@@ -6096,9 +6022,9 @@
       <w:spacing w:val="5"/>
     </w:rPr>
   </w:style>
-  <w:style w:type="character" w:styleId="Rimandocommento">
+  <w:style w:type="character" w:styleId="CommentReference">
     <w:name w:val="annotation reference"/>
-    <w:basedOn w:val="Carpredefinitoparagrafo"/>
+    <w:basedOn w:val="DefaultParagraphFont"/>
     <w:uiPriority w:val="99"/>
     <w:semiHidden/>
     <w:unhideWhenUsed/>
@@ -6108,10 +6034,10 @@
       <w:szCs w:val="16"/>
     </w:rPr>
   </w:style>
-  <w:style w:type="paragraph" w:styleId="Testocommento">
+  <w:style w:type="paragraph" w:styleId="CommentText">
     <w:name w:val="annotation text"/>
-    <w:basedOn w:val="Normale"/>
-    <w:link w:val="TestocommentoCarattere"/>
+    <w:basedOn w:val="Normal"/>
+    <w:link w:val="CommentTextChar"/>
     <w:uiPriority w:val="99"/>
     <w:unhideWhenUsed/>
     <w:rsid w:val="00E15AE4"/>
@@ -6123,10 +6049,10 @@
       <w:szCs w:val="20"/>
     </w:rPr>
   </w:style>
-  <w:style w:type="character" w:customStyle="1" w:styleId="TestocommentoCarattere">
-    <w:name w:val="Testo commento Carattere"/>
-    <w:basedOn w:val="Carpredefinitoparagrafo"/>
-    <w:link w:val="Testocommento"/>
+  <w:style w:type="character" w:customStyle="1" w:styleId="CommentTextChar">
+    <w:name w:val="Comment Text Char"/>
+    <w:basedOn w:val="DefaultParagraphFont"/>
+    <w:link w:val="CommentText"/>
     <w:uiPriority w:val="99"/>
     <w:rsid w:val="00E15AE4"/>
     <w:rPr>
@@ -6134,11 +6060,11 @@
       <w:szCs w:val="20"/>
     </w:rPr>
   </w:style>
-  <w:style w:type="paragraph" w:styleId="Soggettocommento">
+  <w:style w:type="paragraph" w:styleId="CommentSubject">
     <w:name w:val="annotation subject"/>
-    <w:basedOn w:val="Testocommento"/>
-    <w:next w:val="Testocommento"/>
-    <w:link w:val="SoggettocommentoCarattere"/>
+    <w:basedOn w:val="CommentText"/>
+    <w:next w:val="CommentText"/>
+    <w:link w:val="CommentSubjectChar"/>
     <w:uiPriority w:val="99"/>
     <w:semiHidden/>
     <w:unhideWhenUsed/>
@@ -6148,10 +6074,10 @@
       <w:bCs/>
     </w:rPr>
   </w:style>
-  <w:style w:type="character" w:customStyle="1" w:styleId="SoggettocommentoCarattere">
-    <w:name w:val="Soggetto commento Carattere"/>
-    <w:basedOn w:val="TestocommentoCarattere"/>
-    <w:link w:val="Soggettocommento"/>
+  <w:style w:type="character" w:customStyle="1" w:styleId="CommentSubjectChar">
+    <w:name w:val="Comment Subject Char"/>
+    <w:basedOn w:val="CommentTextChar"/>
+    <w:link w:val="CommentSubject"/>
     <w:uiPriority w:val="99"/>
     <w:semiHidden/>
     <w:rsid w:val="00E15AE4"/>
@@ -6162,9 +6088,9 @@
       <w:szCs w:val="20"/>
     </w:rPr>
   </w:style>
-  <w:style w:type="character" w:styleId="Enfasigrassetto">
+  <w:style w:type="character" w:styleId="Strong">
     <w:name w:val="Strong"/>
-    <w:basedOn w:val="Carpredefinitoparagrafo"/>
+    <w:basedOn w:val="DefaultParagraphFont"/>
     <w:uiPriority w:val="22"/>
     <w:qFormat/>
     <w:rsid w:val="00FD27BD"/>
@@ -6173,9 +6099,9 @@
       <w:bCs/>
     </w:rPr>
   </w:style>
-  <w:style w:type="table" w:styleId="Grigliatabella">
+  <w:style w:type="table" w:styleId="TableGrid">
     <w:name w:val="Table Grid"/>
-    <w:basedOn w:val="Tabellanormale"/>
+    <w:basedOn w:val="TableNormal"/>
     <w:uiPriority w:val="59"/>
     <w:rsid w:val="003E05F5"/>
     <w:pPr>
@@ -6192,9 +6118,9 @@
       </w:tblBorders>
     </w:tblPr>
   </w:style>
-  <w:style w:type="character" w:styleId="Collegamentoipertestuale">
+  <w:style w:type="character" w:styleId="Hyperlink">
     <w:name w:val="Hyperlink"/>
-    <w:basedOn w:val="Carpredefinitoparagrafo"/>
+    <w:basedOn w:val="DefaultParagraphFont"/>
     <w:uiPriority w:val="99"/>
     <w:unhideWhenUsed/>
     <w:rsid w:val="003C41F4"/>
@@ -6203,9 +6129,9 @@
       <w:u w:val="single"/>
     </w:rPr>
   </w:style>
-  <w:style w:type="character" w:styleId="Menzionenonrisolta">
+  <w:style w:type="character" w:styleId="UnresolvedMention">
     <w:name w:val="Unresolved Mention"/>
-    <w:basedOn w:val="Carpredefinitoparagrafo"/>
+    <w:basedOn w:val="DefaultParagraphFont"/>
     <w:uiPriority w:val="99"/>
     <w:semiHidden/>
     <w:unhideWhenUsed/>
@@ -6215,9 +6141,9 @@
       <w:shd w:val="clear" w:color="auto" w:fill="E1DFDD"/>
     </w:rPr>
   </w:style>
-  <w:style w:type="character" w:styleId="Collegamentovisitato">
+  <w:style w:type="character" w:styleId="FollowedHyperlink">
     <w:name w:val="FollowedHyperlink"/>
-    <w:basedOn w:val="Carpredefinitoparagrafo"/>
+    <w:basedOn w:val="DefaultParagraphFont"/>
     <w:uiPriority w:val="99"/>
     <w:semiHidden/>
     <w:unhideWhenUsed/>
@@ -6514,14 +6440,6 @@
 </file>
 
 <file path=customXml/item1.xml><?xml version="1.0" encoding="utf-8"?>
-<p:properties xmlns:p="http://schemas.microsoft.com/office/2006/metadata/properties" xmlns:xsi="http://www.w3.org/2001/XMLSchema-instance" xmlns:pc="http://schemas.microsoft.com/office/infopath/2007/PartnerControls">
-  <documentManagement>
-    <_activity xmlns="5a27f7c0-5079-4b07-ba64-6dc03dd2d3af" xsi:nil="true"/>
-  </documentManagement>
-</p:properties>
-</file>
-
-<file path=customXml/item2.xml><?xml version="1.0" encoding="utf-8"?>
 <ct:contentTypeSchema xmlns:ct="http://schemas.microsoft.com/office/2006/metadata/contentType" xmlns:ma="http://schemas.microsoft.com/office/2006/metadata/properties/metaAttributes" ct:_="" ma:_="" ma:contentTypeName="Documento" ma:contentTypeID="0x0101003574973502B84C42B74035BA8AADE1A3" ma:contentTypeVersion="9" ma:contentTypeDescription="Creare un nuovo documento." ma:contentTypeScope="" ma:versionID="1ba771f4a91505810405fb99ac35d176">
   <xsd:schema xmlns:xsd="http://www.w3.org/2001/XMLSchema" xmlns:xs="http://www.w3.org/2001/XMLSchema" xmlns:p="http://schemas.microsoft.com/office/2006/metadata/properties" xmlns:ns3="8f4f0557-6568-4af7-94c6-f11cb446b9b2" xmlns:ns4="5a27f7c0-5079-4b07-ba64-6dc03dd2d3af" targetNamespace="http://schemas.microsoft.com/office/2006/metadata/properties" ma:root="true" ma:fieldsID="a3481e8909782aae8d117dfcc8e1ba87" ns3:_="" ns4:_="">
     <xsd:import namespace="8f4f0557-6568-4af7-94c6-f11cb446b9b2"/>
@@ -6716,7 +6634,19 @@
 </ct:contentTypeSchema>
 </file>
 
+<file path=customXml/item2.xml><?xml version="1.0" encoding="utf-8"?>
+<p:properties xmlns:p="http://schemas.microsoft.com/office/2006/metadata/properties" xmlns:xsi="http://www.w3.org/2001/XMLSchema-instance" xmlns:pc="http://schemas.microsoft.com/office/infopath/2007/PartnerControls">
+  <documentManagement>
+    <_activity xmlns="5a27f7c0-5079-4b07-ba64-6dc03dd2d3af" xsi:nil="true"/>
+  </documentManagement>
+</p:properties>
+</file>
+
 <file path=customXml/item3.xml><?xml version="1.0" encoding="utf-8"?>
+<b:Sources xmlns:b="http://schemas.openxmlformats.org/officeDocument/2006/bibliography" xmlns="http://schemas.openxmlformats.org/officeDocument/2006/bibliography" SelectedStyle="\APASixthEditionOfficeOnline.xsl" StyleName="APA" Version="6"/>
+</file>
+
+<file path=customXml/item4.xml><?xml version="1.0" encoding="utf-8"?>
 <?mso-contentType ?>
 <FormTemplates xmlns="http://schemas.microsoft.com/sharepoint/v3/contenttype/forms">
   <Display>DocumentLibraryForm</Display>
@@ -6725,28 +6655,7 @@
 </FormTemplates>
 </file>
 
-<file path=customXml/item4.xml><?xml version="1.0" encoding="utf-8"?>
-<b:Sources xmlns:b="http://schemas.openxmlformats.org/officeDocument/2006/bibliography" xmlns="http://schemas.openxmlformats.org/officeDocument/2006/bibliography" SelectedStyle="\APASixthEditionOfficeOnline.xsl" StyleName="APA" Version="6"/>
-</file>
-
 <file path=customXml/itemProps1.xml><?xml version="1.0" encoding="utf-8"?>
-<ds:datastoreItem xmlns:ds="http://schemas.openxmlformats.org/officeDocument/2006/customXml" ds:itemID="{BADA3533-255B-4B70-A611-79BA8B58773F}">
-  <ds:schemaRefs>
-    <ds:schemaRef ds:uri="http://purl.org/dc/dcmitype/"/>
-    <ds:schemaRef ds:uri="http://schemas.microsoft.com/office/infopath/2007/PartnerControls"/>
-    <ds:schemaRef ds:uri="http://purl.org/dc/elements/1.1/"/>
-    <ds:schemaRef ds:uri="http://schemas.microsoft.com/office/2006/metadata/properties"/>
-    <ds:schemaRef ds:uri="8f4f0557-6568-4af7-94c6-f11cb446b9b2"/>
-    <ds:schemaRef ds:uri="http://schemas.openxmlformats.org/package/2006/metadata/core-properties"/>
-    <ds:schemaRef ds:uri="http://schemas.microsoft.com/office/2006/documentManagement/types"/>
-    <ds:schemaRef ds:uri="5a27f7c0-5079-4b07-ba64-6dc03dd2d3af"/>
-    <ds:schemaRef ds:uri="http://www.w3.org/XML/1998/namespace"/>
-    <ds:schemaRef ds:uri="http://purl.org/dc/terms/"/>
-  </ds:schemaRefs>
-</ds:datastoreItem>
-</file>
-
-<file path=customXml/itemProps2.xml><?xml version="1.0" encoding="utf-8"?>
 <ds:datastoreItem xmlns:ds="http://schemas.openxmlformats.org/officeDocument/2006/customXml" ds:itemID="{511E4159-463A-40AA-8704-D15F61FF7516}">
   <ds:schemaRefs>
     <ds:schemaRef ds:uri="http://schemas.microsoft.com/office/2006/metadata/contentType"/>
@@ -6765,18 +6674,28 @@
 </ds:datastoreItem>
 </file>
 
+<file path=customXml/itemProps2.xml><?xml version="1.0" encoding="utf-8"?>
+<ds:datastoreItem xmlns:ds="http://schemas.openxmlformats.org/officeDocument/2006/customXml" ds:itemID="{BADA3533-255B-4B70-A611-79BA8B58773F}">
+  <ds:schemaRefs>
+    <ds:schemaRef ds:uri="http://schemas.microsoft.com/office/2006/metadata/properties"/>
+    <ds:schemaRef ds:uri="http://schemas.microsoft.com/office/infopath/2007/PartnerControls"/>
+    <ds:schemaRef ds:uri="5a27f7c0-5079-4b07-ba64-6dc03dd2d3af"/>
+  </ds:schemaRefs>
+</ds:datastoreItem>
+</file>
+
 <file path=customXml/itemProps3.xml><?xml version="1.0" encoding="utf-8"?>
+<ds:datastoreItem xmlns:ds="http://schemas.openxmlformats.org/officeDocument/2006/customXml" ds:itemID="{909AC0DF-D565-4744-A016-96BAFB9D56F1}">
+  <ds:schemaRefs>
+    <ds:schemaRef ds:uri="http://schemas.openxmlformats.org/officeDocument/2006/bibliography"/>
+  </ds:schemaRefs>
+</ds:datastoreItem>
+</file>
+
+<file path=customXml/itemProps4.xml><?xml version="1.0" encoding="utf-8"?>
 <ds:datastoreItem xmlns:ds="http://schemas.openxmlformats.org/officeDocument/2006/customXml" ds:itemID="{98997AA3-7CE8-4868-B6FC-3CB5C609D63B}">
   <ds:schemaRefs>
     <ds:schemaRef ds:uri="http://schemas.microsoft.com/sharepoint/v3/contenttype/forms"/>
   </ds:schemaRefs>
 </ds:datastoreItem>
-</file>
-
-<file path=customXml/itemProps4.xml><?xml version="1.0" encoding="utf-8"?>
-<ds:datastoreItem xmlns:ds="http://schemas.openxmlformats.org/officeDocument/2006/customXml" ds:itemID="{909AC0DF-D565-4744-A016-96BAFB9D56F1}">
-  <ds:schemaRefs>
-    <ds:schemaRef ds:uri="http://schemas.openxmlformats.org/officeDocument/2006/bibliography"/>
-  </ds:schemaRefs>
-</ds:datastoreItem>
 </file>
</xml_diff>

<commit_message>
Aggiunta Diagramma attività e diagramma macchine a stato di creaPartita
</commit_message>
<xml_diff>
--- a/analisiDeiRequisiti.docx
+++ b/analisiDeiRequisiti.docx
@@ -1,11 +1,12 @@
 
 <file path=word/document.xml><?xml version="1.0" encoding="utf-8"?>
-<w:document xmlns:wpc="http://schemas.microsoft.com/office/word/2010/wordprocessingCanvas" xmlns:cx="http://schemas.microsoft.com/office/drawing/2014/chartex" xmlns:cx1="http://schemas.microsoft.com/office/drawing/2015/9/8/chartex" xmlns:cx2="http://schemas.microsoft.com/office/drawing/2015/10/21/chartex" xmlns:cx3="http://schemas.microsoft.com/office/drawing/2016/5/9/chartex" xmlns:cx4="http://schemas.microsoft.com/office/drawing/2016/5/10/chartex" xmlns:cx5="http://schemas.microsoft.com/office/drawing/2016/5/11/chartex" xmlns:cx6="http://schemas.microsoft.com/office/drawing/2016/5/12/chartex" xmlns:cx7="http://schemas.microsoft.com/office/drawing/2016/5/13/chartex" xmlns:cx8="http://schemas.microsoft.com/office/drawing/2016/5/14/chartex" xmlns:mc="http://schemas.openxmlformats.org/markup-compatibility/2006" xmlns:aink="http://schemas.microsoft.com/office/drawing/2016/ink" xmlns:am3d="http://schemas.microsoft.com/office/drawing/2017/model3d" xmlns:o="urn:schemas-microsoft-com:office:office" xmlns:oel="http://schemas.microsoft.com/office/2019/extlst" xmlns:r="http://schemas.openxmlformats.org/officeDocument/2006/relationships" xmlns:m="http://schemas.openxmlformats.org/officeDocument/2006/math" xmlns:v="urn:schemas-microsoft-com:vml" xmlns:wp14="http://schemas.microsoft.com/office/word/2010/wordprocessingDrawing" xmlns:wp="http://schemas.openxmlformats.org/drawingml/2006/wordprocessingDrawing" xmlns:w10="urn:schemas-microsoft-com:office:word" xmlns:w="http://schemas.openxmlformats.org/wordprocessingml/2006/main" xmlns:w14="http://schemas.microsoft.com/office/word/2010/wordml" xmlns:w15="http://schemas.microsoft.com/office/word/2012/wordml" xmlns:w16cex="http://schemas.microsoft.com/office/word/2018/wordml/cex" xmlns:w16cid="http://schemas.microsoft.com/office/word/2016/wordml/cid" xmlns:w16="http://schemas.microsoft.com/office/word/2018/wordml" xmlns:w16du="http://schemas.microsoft.com/office/word/2023/wordml/word16du" xmlns:w16sdtdh="http://schemas.microsoft.com/office/word/2020/wordml/sdtdatahash" xmlns:w16se="http://schemas.microsoft.com/office/word/2015/wordml/symex" xmlns:wpg="http://schemas.microsoft.com/office/word/2010/wordprocessingGroup" xmlns:wpi="http://schemas.microsoft.com/office/word/2010/wordprocessingInk" xmlns:wne="http://schemas.microsoft.com/office/word/2006/wordml" xmlns:wps="http://schemas.microsoft.com/office/word/2010/wordprocessingShape" mc:Ignorable="w14 w15 w16se w16cid w16 w16cex w16sdtdh w16du wp14">
+<w:document xmlns:wpc="http://schemas.microsoft.com/office/word/2010/wordprocessingCanvas" xmlns:cx="http://schemas.microsoft.com/office/drawing/2014/chartex" xmlns:cx1="http://schemas.microsoft.com/office/drawing/2015/9/8/chartex" xmlns:cx2="http://schemas.microsoft.com/office/drawing/2015/10/21/chartex" xmlns:cx3="http://schemas.microsoft.com/office/drawing/2016/5/9/chartex" xmlns:cx4="http://schemas.microsoft.com/office/drawing/2016/5/10/chartex" xmlns:cx5="http://schemas.microsoft.com/office/drawing/2016/5/11/chartex" xmlns:cx6="http://schemas.microsoft.com/office/drawing/2016/5/12/chartex" xmlns:cx7="http://schemas.microsoft.com/office/drawing/2016/5/13/chartex" xmlns:cx8="http://schemas.microsoft.com/office/drawing/2016/5/14/chartex" xmlns:mc="http://schemas.openxmlformats.org/markup-compatibility/2006" xmlns:aink="http://schemas.microsoft.com/office/drawing/2016/ink" xmlns:am3d="http://schemas.microsoft.com/office/drawing/2017/model3d" xmlns:o="urn:schemas-microsoft-com:office:office" xmlns:oel="http://schemas.microsoft.com/office/2019/extlst" xmlns:r="http://schemas.openxmlformats.org/officeDocument/2006/relationships" xmlns:m="http://schemas.openxmlformats.org/officeDocument/2006/math" xmlns:v="urn:schemas-microsoft-com:vml" xmlns:wp14="http://schemas.microsoft.com/office/word/2010/wordprocessingDrawing" xmlns:wp="http://schemas.openxmlformats.org/drawingml/2006/wordprocessingDrawing" xmlns:w10="urn:schemas-microsoft-com:office:word" xmlns:w="http://schemas.openxmlformats.org/wordprocessingml/2006/main" xmlns:w14="http://schemas.microsoft.com/office/word/2010/wordml" xmlns:w15="http://schemas.microsoft.com/office/word/2012/wordml" xmlns:w16cex="http://schemas.microsoft.com/office/word/2018/wordml/cex" xmlns:w16cid="http://schemas.microsoft.com/office/word/2016/wordml/cid" xmlns:w16="http://schemas.microsoft.com/office/word/2018/wordml" xmlns:w16du="http://schemas.microsoft.com/office/word/2023/wordml/word16du" xmlns:w16sdtdh="http://schemas.microsoft.com/office/word/2020/wordml/sdtdatahash" xmlns:w16sdtfl="http://schemas.microsoft.com/office/word/2024/wordml/sdtformatlock" xmlns:w16se="http://schemas.microsoft.com/office/word/2015/wordml/symex" xmlns:wpg="http://schemas.microsoft.com/office/word/2010/wordprocessingGroup" xmlns:wpi="http://schemas.microsoft.com/office/word/2010/wordprocessingInk" xmlns:wne="http://schemas.microsoft.com/office/word/2006/wordml" xmlns:wps="http://schemas.microsoft.com/office/word/2010/wordprocessingShape" mc:Ignorable="w14 w15 w16se w16cid w16 w16cex w16sdtdh w16sdtfl w16du wp14">
   <w:body>
     <w:p>
       <w:pPr>
         <w:ind w:left="708"/>
       </w:pPr>
+      <w:proofErr w:type="spellStart"/>
       <w:r>
         <w:rPr>
           <w:b/>
@@ -13,6 +14,7 @@
         </w:rPr>
         <w:t>NewMonopoly</w:t>
       </w:r>
+      <w:proofErr w:type="spellEnd"/>
     </w:p>
     <w:p>
       <w:pPr>
@@ -46,7 +48,15 @@
         <w:ind w:left="708"/>
       </w:pPr>
       <w:r>
-        <w:t>In questo progetto, svilupperai una versione client-server altamente configurabile e a turni del gioco del Monopoli che supera le limitazioni sopra menzionate.</w:t>
+        <w:t xml:space="preserve">In questo progetto, svilupperai una versione </w:t>
+      </w:r>
+      <w:proofErr w:type="spellStart"/>
+      <w:r>
+        <w:t>client-server</w:t>
+      </w:r>
+      <w:proofErr w:type="spellEnd"/>
+      <w:r>
+        <w:t xml:space="preserve"> altamente configurabile e a turni del gioco del Monopoli che supera le limitazioni sopra menzionate.</w:t>
       </w:r>
     </w:p>
     <w:p>
@@ -62,7 +72,14 @@
       </w:r>
       <w:r>
         <w:br/>
-        <w:t>NewMonopoly è una versione computerizzata e altamente configurabile del gioco del Monopoli. Monopoli è un gioco da tavolo a turni, giocato su un tabellone che raffigura 40 caselle contenenti: 28 proprietà, cioè 22 strade (classificate in 8 gruppi di colore), 4 stazioni ferroviarie e 2 utenze; 3 caselle Probabilità; 3 caselle Imprevisti; una casella Tassa di Lusso; una casella Tassa sul Reddito; e 4 angoli (Partenza, Prigione/In Visita, Parcheggio Gratuito, e Vai in Prigione). Lo scopo del gioco è mandare gli avversari in bancarotta, lasciando un unico monopolista a controllare l'economia. Ogni giocatore inizia il gioco con un segnalino sulla casella Partenza e 1.500 di una valuta locale in denaro fittizio suddiviso in banconote da 1, 5, 10, 20, 50, 100 e 500. Il movimento dei segnalini sul tabellone è determinato dal lancio dei dadi.</w:t>
+      </w:r>
+      <w:proofErr w:type="spellStart"/>
+      <w:r>
+        <w:t>NewMonopoly</w:t>
+      </w:r>
+      <w:proofErr w:type="spellEnd"/>
+      <w:r>
+        <w:t xml:space="preserve"> è una versione computerizzata e altamente configurabile del gioco del Monopoli. Monopoli è un gioco da tavolo a turni, giocato su un tabellone che raffigura 40 caselle contenenti: 28 proprietà, cioè 22 strade (classificate in 8 gruppi di colore), 4 stazioni ferroviarie e 2 utenze; 3 caselle Probabilità; 3 caselle Imprevisti; una casella Tassa di Lusso; una casella Tassa sul Reddito; e 4 angoli (Partenza, Prigione/In Visita, Parcheggio Gratuito, e Vai in Prigione). Lo scopo del gioco è mandare gli avversari in bancarotta, lasciando un unico monopolista a controllare l'economia. Ogni giocatore inizia il gioco con un segnalino sulla casella Partenza e 1.500 di una valuta locale in denaro fittizio suddiviso in banconote da 1, 5, 10, 20, 50, 100 e 500. Il movimento dei segnalini sul tabellone è determinato dal lancio dei dadi.</w:t>
       </w:r>
     </w:p>
     <w:p>
@@ -70,15 +87,33 @@
         <w:ind w:left="708"/>
       </w:pPr>
       <w:r>
-        <w:t xml:space="preserve">L'obiettivo di questo progetto è creare una versione client-server a turni di NewMonopoly con alta configurabilità, in cui gli utenti giocano attraverso un sito web. Il gioco deve implementare tutte le funzionalità principali della versione standard del Monopoli (vedi </w:t>
+        <w:t xml:space="preserve">L'obiettivo di questo progetto è creare una versione </w:t>
+      </w:r>
+      <w:proofErr w:type="spellStart"/>
+      <w:r>
+        <w:t>client-server</w:t>
+      </w:r>
+      <w:proofErr w:type="spellEnd"/>
+      <w:r>
+        <w:t xml:space="preserve"> a turni di </w:t>
+      </w:r>
+      <w:proofErr w:type="spellStart"/>
+      <w:r>
+        <w:t>NewMonopoly</w:t>
+      </w:r>
+      <w:proofErr w:type="spellEnd"/>
+      <w:r>
+        <w:t xml:space="preserve"> con alta configurabilità, in cui gli utenti giocano attraverso un sito web. Il gioco deve implementare tutte le funzionalità principali della versione standard del Monopoli (vedi </w:t>
       </w:r>
       <w:hyperlink r:id="rId9" w:tgtFrame="_new" w:history="1">
+        <w:proofErr w:type="spellStart"/>
         <w:r>
           <w:rPr>
             <w:rStyle w:val="Collegamentoipertestuale"/>
           </w:rPr>
           <w:t>Wikipe</w:t>
         </w:r>
+        <w:proofErr w:type="spellEnd"/>
         <w:r>
           <w:rPr>
             <w:rStyle w:val="Collegamentoipertestuale"/>
@@ -185,7 +220,23 @@
       </w:r>
       <w:r>
         <w:br/>
-        <w:t>Il progetto deve implementare le funzionalità descritte sopra, cioè tutte le regole del Monopoli standard più le caratteristiche di configurabilità. I team possono scegliere la piattaforma di sviluppo, inclusi gli strumenti e i linguaggi di programmazione da utilizzare. Poiché il gioco è basato sul web, i framework MVC possono essere utili. I team devono anche fornire documentazione, inclusi un documento sui requisiti, un documento di progettazione e un breve manuale utente (installazione e modalità di gioco).</w:t>
+        <w:t xml:space="preserve">Il progetto deve implementare le funzionalità descritte sopra, cioè tutte le regole del Monopoli standard più le caratteristiche di configurabilità. </w:t>
+      </w:r>
+      <w:proofErr w:type="gramStart"/>
+      <w:r>
+        <w:t>I team</w:t>
+      </w:r>
+      <w:proofErr w:type="gramEnd"/>
+      <w:r>
+        <w:t xml:space="preserve"> possono scegliere la piattaforma di sviluppo, inclusi gli strumenti e i linguaggi di programmazione da utilizzare. Poiché il gioco è basato sul web, i framework MVC possono essere utili. </w:t>
+      </w:r>
+      <w:proofErr w:type="gramStart"/>
+      <w:r>
+        <w:t>I team</w:t>
+      </w:r>
+      <w:proofErr w:type="gramEnd"/>
+      <w:r>
+        <w:t xml:space="preserve"> devono anche fornire documentazione, inclusi un documento sui requisiti, un documento di progettazione e un breve manuale utente (installazione e modalità di gioco).</w:t>
       </w:r>
     </w:p>
     <w:p>
@@ -198,6 +249,7 @@
         <w:pStyle w:val="Titolo1"/>
       </w:pPr>
       <w:r>
+        <w:lastRenderedPageBreak/>
         <w:t>ANALISI DEI REQUISITI:</w:t>
       </w:r>
     </w:p>
@@ -614,7 +666,15 @@
         <w:t xml:space="preserve"> imposta per </w:t>
       </w:r>
       <w:r>
-        <w:t>ogni 5 turni un</w:t>
+        <w:t xml:space="preserve">ogni </w:t>
+      </w:r>
+      <w:proofErr w:type="gramStart"/>
+      <w:r>
+        <w:t>5</w:t>
+      </w:r>
+      <w:proofErr w:type="gramEnd"/>
+      <w:r>
+        <w:t xml:space="preserve"> turni un</w:t>
       </w:r>
       <w:r>
         <w:t xml:space="preserve"> “</w:t>
@@ -910,6 +970,7 @@
           <w:b/>
           <w:bCs/>
         </w:rPr>
+        <w:lastRenderedPageBreak/>
         <w:t>Medio:</w:t>
       </w:r>
     </w:p>
@@ -1257,9 +1318,19 @@
       </w:r>
     </w:p>
     <w:p>
-      <w:r>
-        <w:t>Per semplicità ho messo che se l’admin esce la partita termina, se esce un giocatore i suoi averi passano alla bancaca</w:t>
-      </w:r>
+      <w:pPr>
+        <w:rPr>
+          <w:u w:val="single"/>
+        </w:rPr>
+      </w:pPr>
+      <w:r>
+        <w:t xml:space="preserve">Per semplicità ho messo che se l’admin esce la partita termina, se esce un giocatore i suoi averi passano alla </w:t>
+      </w:r>
+      <w:proofErr w:type="spellStart"/>
+      <w:r>
+        <w:t>banca</w:t>
+      </w:r>
+      <w:proofErr w:type="spellEnd"/>
     </w:p>
     <w:sectPr>
       <w:pgSz w:w="11906" w:h="16838"/>
@@ -1272,7 +1343,7 @@
 </file>
 
 <file path=word/comments.xml><?xml version="1.0" encoding="utf-8"?>
-<w:comments xmlns:wpc="http://schemas.microsoft.com/office/word/2010/wordprocessingCanvas" xmlns:cx="http://schemas.microsoft.com/office/drawing/2014/chartex" xmlns:cx1="http://schemas.microsoft.com/office/drawing/2015/9/8/chartex" xmlns:cx2="http://schemas.microsoft.com/office/drawing/2015/10/21/chartex" xmlns:cx3="http://schemas.microsoft.com/office/drawing/2016/5/9/chartex" xmlns:cx4="http://schemas.microsoft.com/office/drawing/2016/5/10/chartex" xmlns:cx5="http://schemas.microsoft.com/office/drawing/2016/5/11/chartex" xmlns:cx6="http://schemas.microsoft.com/office/drawing/2016/5/12/chartex" xmlns:cx7="http://schemas.microsoft.com/office/drawing/2016/5/13/chartex" xmlns:cx8="http://schemas.microsoft.com/office/drawing/2016/5/14/chartex" xmlns:mc="http://schemas.openxmlformats.org/markup-compatibility/2006" xmlns:aink="http://schemas.microsoft.com/office/drawing/2016/ink" xmlns:am3d="http://schemas.microsoft.com/office/drawing/2017/model3d" xmlns:o="urn:schemas-microsoft-com:office:office" xmlns:oel="http://schemas.microsoft.com/office/2019/extlst" xmlns:r="http://schemas.openxmlformats.org/officeDocument/2006/relationships" xmlns:m="http://schemas.openxmlformats.org/officeDocument/2006/math" xmlns:v="urn:schemas-microsoft-com:vml" xmlns:wp14="http://schemas.microsoft.com/office/word/2010/wordprocessingDrawing" xmlns:wp="http://schemas.openxmlformats.org/drawingml/2006/wordprocessingDrawing" xmlns:w10="urn:schemas-microsoft-com:office:word" xmlns:w="http://schemas.openxmlformats.org/wordprocessingml/2006/main" xmlns:w14="http://schemas.microsoft.com/office/word/2010/wordml" xmlns:w15="http://schemas.microsoft.com/office/word/2012/wordml" xmlns:w16cex="http://schemas.microsoft.com/office/word/2018/wordml/cex" xmlns:w16cid="http://schemas.microsoft.com/office/word/2016/wordml/cid" xmlns:w16="http://schemas.microsoft.com/office/word/2018/wordml" xmlns:w16du="http://schemas.microsoft.com/office/word/2023/wordml/word16du" xmlns:w16sdtdh="http://schemas.microsoft.com/office/word/2020/wordml/sdtdatahash" xmlns:w16se="http://schemas.microsoft.com/office/word/2015/wordml/symex" xmlns:wpg="http://schemas.microsoft.com/office/word/2010/wordprocessingGroup" xmlns:wpi="http://schemas.microsoft.com/office/word/2010/wordprocessingInk" xmlns:wne="http://schemas.microsoft.com/office/word/2006/wordml" xmlns:wps="http://schemas.microsoft.com/office/word/2010/wordprocessingShape" mc:Ignorable="w14 w15 w16se w16cid w16 w16cex w16sdtdh w16du wp14">
+<w:comments xmlns:wpc="http://schemas.microsoft.com/office/word/2010/wordprocessingCanvas" xmlns:cx="http://schemas.microsoft.com/office/drawing/2014/chartex" xmlns:cx1="http://schemas.microsoft.com/office/drawing/2015/9/8/chartex" xmlns:cx2="http://schemas.microsoft.com/office/drawing/2015/10/21/chartex" xmlns:cx3="http://schemas.microsoft.com/office/drawing/2016/5/9/chartex" xmlns:cx4="http://schemas.microsoft.com/office/drawing/2016/5/10/chartex" xmlns:cx5="http://schemas.microsoft.com/office/drawing/2016/5/11/chartex" xmlns:cx6="http://schemas.microsoft.com/office/drawing/2016/5/12/chartex" xmlns:cx7="http://schemas.microsoft.com/office/drawing/2016/5/13/chartex" xmlns:cx8="http://schemas.microsoft.com/office/drawing/2016/5/14/chartex" xmlns:mc="http://schemas.openxmlformats.org/markup-compatibility/2006" xmlns:aink="http://schemas.microsoft.com/office/drawing/2016/ink" xmlns:am3d="http://schemas.microsoft.com/office/drawing/2017/model3d" xmlns:o="urn:schemas-microsoft-com:office:office" xmlns:oel="http://schemas.microsoft.com/office/2019/extlst" xmlns:r="http://schemas.openxmlformats.org/officeDocument/2006/relationships" xmlns:m="http://schemas.openxmlformats.org/officeDocument/2006/math" xmlns:v="urn:schemas-microsoft-com:vml" xmlns:wp14="http://schemas.microsoft.com/office/word/2010/wordprocessingDrawing" xmlns:wp="http://schemas.openxmlformats.org/drawingml/2006/wordprocessingDrawing" xmlns:w10="urn:schemas-microsoft-com:office:word" xmlns:w="http://schemas.openxmlformats.org/wordprocessingml/2006/main" xmlns:w14="http://schemas.microsoft.com/office/word/2010/wordml" xmlns:w15="http://schemas.microsoft.com/office/word/2012/wordml" xmlns:w16cex="http://schemas.microsoft.com/office/word/2018/wordml/cex" xmlns:w16cid="http://schemas.microsoft.com/office/word/2016/wordml/cid" xmlns:w16="http://schemas.microsoft.com/office/word/2018/wordml" xmlns:w16du="http://schemas.microsoft.com/office/word/2023/wordml/word16du" xmlns:w16sdtdh="http://schemas.microsoft.com/office/word/2020/wordml/sdtdatahash" xmlns:w16sdtfl="http://schemas.microsoft.com/office/word/2024/wordml/sdtformatlock" xmlns:w16se="http://schemas.microsoft.com/office/word/2015/wordml/symex" xmlns:wpg="http://schemas.microsoft.com/office/word/2010/wordprocessingGroup" xmlns:wpi="http://schemas.microsoft.com/office/word/2010/wordprocessingInk" xmlns:wne="http://schemas.microsoft.com/office/word/2006/wordml" xmlns:wps="http://schemas.microsoft.com/office/word/2010/wordprocessingShape" mc:Ignorable="w14 w15 w16se w16cid w16 w16cex w16sdtdh w16sdtfl w16du wp14">
   <w:comment w:id="0" w:author="f.tentori4@campus.unimib.it" w:date="2024-12-23T16:39:00Z" w:initials="FT">
     <w:p>
       <w:pPr>
@@ -1476,7 +1547,7 @@
 </file>
 
 <file path=word/commentsExtended.xml><?xml version="1.0" encoding="utf-8"?>
-<w15:commentsEx xmlns:wpc="http://schemas.microsoft.com/office/word/2010/wordprocessingCanvas" xmlns:cx="http://schemas.microsoft.com/office/drawing/2014/chartex" xmlns:cx1="http://schemas.microsoft.com/office/drawing/2015/9/8/chartex" xmlns:cx2="http://schemas.microsoft.com/office/drawing/2015/10/21/chartex" xmlns:cx3="http://schemas.microsoft.com/office/drawing/2016/5/9/chartex" xmlns:cx4="http://schemas.microsoft.com/office/drawing/2016/5/10/chartex" xmlns:cx5="http://schemas.microsoft.com/office/drawing/2016/5/11/chartex" xmlns:cx6="http://schemas.microsoft.com/office/drawing/2016/5/12/chartex" xmlns:cx7="http://schemas.microsoft.com/office/drawing/2016/5/13/chartex" xmlns:cx8="http://schemas.microsoft.com/office/drawing/2016/5/14/chartex" xmlns:mc="http://schemas.openxmlformats.org/markup-compatibility/2006" xmlns:aink="http://schemas.microsoft.com/office/drawing/2016/ink" xmlns:am3d="http://schemas.microsoft.com/office/drawing/2017/model3d" xmlns:o="urn:schemas-microsoft-com:office:office" xmlns:oel="http://schemas.microsoft.com/office/2019/extlst" xmlns:r="http://schemas.openxmlformats.org/officeDocument/2006/relationships" xmlns:m="http://schemas.openxmlformats.org/officeDocument/2006/math" xmlns:v="urn:schemas-microsoft-com:vml" xmlns:wp14="http://schemas.microsoft.com/office/word/2010/wordprocessingDrawing" xmlns:wp="http://schemas.openxmlformats.org/drawingml/2006/wordprocessingDrawing" xmlns:w10="urn:schemas-microsoft-com:office:word" xmlns:w="http://schemas.openxmlformats.org/wordprocessingml/2006/main" xmlns:w14="http://schemas.microsoft.com/office/word/2010/wordml" xmlns:w15="http://schemas.microsoft.com/office/word/2012/wordml" xmlns:w16cex="http://schemas.microsoft.com/office/word/2018/wordml/cex" xmlns:w16cid="http://schemas.microsoft.com/office/word/2016/wordml/cid" xmlns:w16="http://schemas.microsoft.com/office/word/2018/wordml" xmlns:w16du="http://schemas.microsoft.com/office/word/2023/wordml/word16du" xmlns:w16sdtdh="http://schemas.microsoft.com/office/word/2020/wordml/sdtdatahash" xmlns:w16se="http://schemas.microsoft.com/office/word/2015/wordml/symex" xmlns:wpg="http://schemas.microsoft.com/office/word/2010/wordprocessingGroup" xmlns:wpi="http://schemas.microsoft.com/office/word/2010/wordprocessingInk" xmlns:wne="http://schemas.microsoft.com/office/word/2006/wordml" xmlns:wps="http://schemas.microsoft.com/office/word/2010/wordprocessingShape" mc:Ignorable="w14 w15 w16se w16cid w16 w16cex w16sdtdh w16du wp14">
+<w15:commentsEx xmlns:wpc="http://schemas.microsoft.com/office/word/2010/wordprocessingCanvas" xmlns:cx="http://schemas.microsoft.com/office/drawing/2014/chartex" xmlns:cx1="http://schemas.microsoft.com/office/drawing/2015/9/8/chartex" xmlns:cx2="http://schemas.microsoft.com/office/drawing/2015/10/21/chartex" xmlns:cx3="http://schemas.microsoft.com/office/drawing/2016/5/9/chartex" xmlns:cx4="http://schemas.microsoft.com/office/drawing/2016/5/10/chartex" xmlns:cx5="http://schemas.microsoft.com/office/drawing/2016/5/11/chartex" xmlns:cx6="http://schemas.microsoft.com/office/drawing/2016/5/12/chartex" xmlns:cx7="http://schemas.microsoft.com/office/drawing/2016/5/13/chartex" xmlns:cx8="http://schemas.microsoft.com/office/drawing/2016/5/14/chartex" xmlns:mc="http://schemas.openxmlformats.org/markup-compatibility/2006" xmlns:aink="http://schemas.microsoft.com/office/drawing/2016/ink" xmlns:am3d="http://schemas.microsoft.com/office/drawing/2017/model3d" xmlns:o="urn:schemas-microsoft-com:office:office" xmlns:oel="http://schemas.microsoft.com/office/2019/extlst" xmlns:r="http://schemas.openxmlformats.org/officeDocument/2006/relationships" xmlns:m="http://schemas.openxmlformats.org/officeDocument/2006/math" xmlns:v="urn:schemas-microsoft-com:vml" xmlns:wp14="http://schemas.microsoft.com/office/word/2010/wordprocessingDrawing" xmlns:wp="http://schemas.openxmlformats.org/drawingml/2006/wordprocessingDrawing" xmlns:w10="urn:schemas-microsoft-com:office:word" xmlns:w="http://schemas.openxmlformats.org/wordprocessingml/2006/main" xmlns:w14="http://schemas.microsoft.com/office/word/2010/wordml" xmlns:w15="http://schemas.microsoft.com/office/word/2012/wordml" xmlns:w16cex="http://schemas.microsoft.com/office/word/2018/wordml/cex" xmlns:w16cid="http://schemas.microsoft.com/office/word/2016/wordml/cid" xmlns:w16="http://schemas.microsoft.com/office/word/2018/wordml" xmlns:w16du="http://schemas.microsoft.com/office/word/2023/wordml/word16du" xmlns:w16sdtdh="http://schemas.microsoft.com/office/word/2020/wordml/sdtdatahash" xmlns:w16sdtfl="http://schemas.microsoft.com/office/word/2024/wordml/sdtformatlock" xmlns:w16se="http://schemas.microsoft.com/office/word/2015/wordml/symex" xmlns:wpg="http://schemas.microsoft.com/office/word/2010/wordprocessingGroup" xmlns:wpi="http://schemas.microsoft.com/office/word/2010/wordprocessingInk" xmlns:wne="http://schemas.microsoft.com/office/word/2006/wordml" xmlns:wps="http://schemas.microsoft.com/office/word/2010/wordprocessingShape" mc:Ignorable="w14 w15 w16se w16cid w16 w16cex w16sdtdh w16sdtfl w16du wp14">
   <w15:commentEx w15:paraId="034318FB" w15:done="0"/>
   <w15:commentEx w15:paraId="75037570" w15:paraIdParent="034318FB" w15:done="0"/>
   <w15:commentEx w15:paraId="1340C9E6" w15:paraIdParent="034318FB" w15:done="0"/>
@@ -1491,7 +1562,7 @@
 </file>
 
 <file path=word/commentsExtensible.xml><?xml version="1.0" encoding="utf-8"?>
-<w16cex:commentsExtensible xmlns:wpc="http://schemas.microsoft.com/office/word/2010/wordprocessingCanvas" xmlns:cx="http://schemas.microsoft.com/office/drawing/2014/chartex" xmlns:cx1="http://schemas.microsoft.com/office/drawing/2015/9/8/chartex" xmlns:cx2="http://schemas.microsoft.com/office/drawing/2015/10/21/chartex" xmlns:cx3="http://schemas.microsoft.com/office/drawing/2016/5/9/chartex" xmlns:cx4="http://schemas.microsoft.com/office/drawing/2016/5/10/chartex" xmlns:cx5="http://schemas.microsoft.com/office/drawing/2016/5/11/chartex" xmlns:cx6="http://schemas.microsoft.com/office/drawing/2016/5/12/chartex" xmlns:cx7="http://schemas.microsoft.com/office/drawing/2016/5/13/chartex" xmlns:cx8="http://schemas.microsoft.com/office/drawing/2016/5/14/chartex" xmlns:cr="http://schemas.microsoft.com/office/comments/2020/reactions" xmlns:mc="http://schemas.openxmlformats.org/markup-compatibility/2006" xmlns:aink="http://schemas.microsoft.com/office/drawing/2016/ink" xmlns:am3d="http://schemas.microsoft.com/office/drawing/2017/model3d" xmlns:o="urn:schemas-microsoft-com:office:office" xmlns:oel="http://schemas.microsoft.com/office/2019/extlst" xmlns:r="http://schemas.openxmlformats.org/officeDocument/2006/relationships" xmlns:m="http://schemas.openxmlformats.org/officeDocument/2006/math" xmlns:v="urn:schemas-microsoft-com:vml" xmlns:wp14="http://schemas.microsoft.com/office/word/2010/wordprocessingDrawing" xmlns:wp="http://schemas.openxmlformats.org/drawingml/2006/wordprocessingDrawing" xmlns:w10="urn:schemas-microsoft-com:office:word" xmlns:w="http://schemas.openxmlformats.org/wordprocessingml/2006/main" xmlns:w14="http://schemas.microsoft.com/office/word/2010/wordml" xmlns:w15="http://schemas.microsoft.com/office/word/2012/wordml" xmlns:w16cex="http://schemas.microsoft.com/office/word/2018/wordml/cex" xmlns:w16cid="http://schemas.microsoft.com/office/word/2016/wordml/cid" xmlns:w16="http://schemas.microsoft.com/office/word/2018/wordml" xmlns:w16du="http://schemas.microsoft.com/office/word/2023/wordml/word16du" xmlns:w16sdtdh="http://schemas.microsoft.com/office/word/2020/wordml/sdtdatahash" xmlns:w16se="http://schemas.microsoft.com/office/word/2015/wordml/symex" xmlns:wpg="http://schemas.microsoft.com/office/word/2010/wordprocessingGroup" xmlns:wpi="http://schemas.microsoft.com/office/word/2010/wordprocessingInk" xmlns:wne="http://schemas.microsoft.com/office/word/2006/wordml" xmlns:wps="http://schemas.microsoft.com/office/word/2010/wordprocessingShape" mc:Ignorable="w14 w15 w16se w16cid w16 w16cex w16sdtdh cr w16du wp14">
+<w16cex:commentsExtensible xmlns:wpc="http://schemas.microsoft.com/office/word/2010/wordprocessingCanvas" xmlns:cx="http://schemas.microsoft.com/office/drawing/2014/chartex" xmlns:cx1="http://schemas.microsoft.com/office/drawing/2015/9/8/chartex" xmlns:cx2="http://schemas.microsoft.com/office/drawing/2015/10/21/chartex" xmlns:cx3="http://schemas.microsoft.com/office/drawing/2016/5/9/chartex" xmlns:cx4="http://schemas.microsoft.com/office/drawing/2016/5/10/chartex" xmlns:cx5="http://schemas.microsoft.com/office/drawing/2016/5/11/chartex" xmlns:cx6="http://schemas.microsoft.com/office/drawing/2016/5/12/chartex" xmlns:cx7="http://schemas.microsoft.com/office/drawing/2016/5/13/chartex" xmlns:cx8="http://schemas.microsoft.com/office/drawing/2016/5/14/chartex" xmlns:cr="http://schemas.microsoft.com/office/comments/2020/reactions" xmlns:mc="http://schemas.openxmlformats.org/markup-compatibility/2006" xmlns:aink="http://schemas.microsoft.com/office/drawing/2016/ink" xmlns:am3d="http://schemas.microsoft.com/office/drawing/2017/model3d" xmlns:o="urn:schemas-microsoft-com:office:office" xmlns:oel="http://schemas.microsoft.com/office/2019/extlst" xmlns:r="http://schemas.openxmlformats.org/officeDocument/2006/relationships" xmlns:m="http://schemas.openxmlformats.org/officeDocument/2006/math" xmlns:v="urn:schemas-microsoft-com:vml" xmlns:wp14="http://schemas.microsoft.com/office/word/2010/wordprocessingDrawing" xmlns:wp="http://schemas.openxmlformats.org/drawingml/2006/wordprocessingDrawing" xmlns:w10="urn:schemas-microsoft-com:office:word" xmlns:w="http://schemas.openxmlformats.org/wordprocessingml/2006/main" xmlns:w14="http://schemas.microsoft.com/office/word/2010/wordml" xmlns:w15="http://schemas.microsoft.com/office/word/2012/wordml" xmlns:w16cex="http://schemas.microsoft.com/office/word/2018/wordml/cex" xmlns:w16cid="http://schemas.microsoft.com/office/word/2016/wordml/cid" xmlns:w16="http://schemas.microsoft.com/office/word/2018/wordml" xmlns:w16du="http://schemas.microsoft.com/office/word/2023/wordml/word16du" xmlns:w16sdtdh="http://schemas.microsoft.com/office/word/2020/wordml/sdtdatahash" xmlns:w16sdtfl="http://schemas.microsoft.com/office/word/2024/wordml/sdtformatlock" xmlns:w16se="http://schemas.microsoft.com/office/word/2015/wordml/symex" xmlns:wpg="http://schemas.microsoft.com/office/word/2010/wordprocessingGroup" xmlns:wpi="http://schemas.microsoft.com/office/word/2010/wordprocessingInk" xmlns:wne="http://schemas.microsoft.com/office/word/2006/wordml" xmlns:wps="http://schemas.microsoft.com/office/word/2010/wordprocessingShape" mc:Ignorable="w14 w15 w16se w16cid w16 w16cex w16sdtdh w16sdtfl cr w16du wp14">
   <w16cex:commentExtensible w16cex:durableId="218E0726" w16cex:dateUtc="2024-12-23T15:39:00Z"/>
   <w16cex:commentExtensible w16cex:durableId="6633EED1" w16cex:dateUtc="2024-12-23T15:42:00Z"/>
   <w16cex:commentExtensible w16cex:durableId="2B1415D4" w16cex:dateUtc="2024-12-23T16:01:00Z"/>
@@ -1506,7 +1577,7 @@
 </file>
 
 <file path=word/commentsIds.xml><?xml version="1.0" encoding="utf-8"?>
-<w16cid:commentsIds xmlns:wpc="http://schemas.microsoft.com/office/word/2010/wordprocessingCanvas" xmlns:cx="http://schemas.microsoft.com/office/drawing/2014/chartex" xmlns:cx1="http://schemas.microsoft.com/office/drawing/2015/9/8/chartex" xmlns:cx2="http://schemas.microsoft.com/office/drawing/2015/10/21/chartex" xmlns:cx3="http://schemas.microsoft.com/office/drawing/2016/5/9/chartex" xmlns:cx4="http://schemas.microsoft.com/office/drawing/2016/5/10/chartex" xmlns:cx5="http://schemas.microsoft.com/office/drawing/2016/5/11/chartex" xmlns:cx6="http://schemas.microsoft.com/office/drawing/2016/5/12/chartex" xmlns:cx7="http://schemas.microsoft.com/office/drawing/2016/5/13/chartex" xmlns:cx8="http://schemas.microsoft.com/office/drawing/2016/5/14/chartex" xmlns:mc="http://schemas.openxmlformats.org/markup-compatibility/2006" xmlns:aink="http://schemas.microsoft.com/office/drawing/2016/ink" xmlns:am3d="http://schemas.microsoft.com/office/drawing/2017/model3d" xmlns:o="urn:schemas-microsoft-com:office:office" xmlns:oel="http://schemas.microsoft.com/office/2019/extlst" xmlns:r="http://schemas.openxmlformats.org/officeDocument/2006/relationships" xmlns:m="http://schemas.openxmlformats.org/officeDocument/2006/math" xmlns:v="urn:schemas-microsoft-com:vml" xmlns:wp14="http://schemas.microsoft.com/office/word/2010/wordprocessingDrawing" xmlns:wp="http://schemas.openxmlformats.org/drawingml/2006/wordprocessingDrawing" xmlns:w10="urn:schemas-microsoft-com:office:word" xmlns:w="http://schemas.openxmlformats.org/wordprocessingml/2006/main" xmlns:w14="http://schemas.microsoft.com/office/word/2010/wordml" xmlns:w15="http://schemas.microsoft.com/office/word/2012/wordml" xmlns:w16cex="http://schemas.microsoft.com/office/word/2018/wordml/cex" xmlns:w16cid="http://schemas.microsoft.com/office/word/2016/wordml/cid" xmlns:w16="http://schemas.microsoft.com/office/word/2018/wordml" xmlns:w16du="http://schemas.microsoft.com/office/word/2023/wordml/word16du" xmlns:w16sdtdh="http://schemas.microsoft.com/office/word/2020/wordml/sdtdatahash" xmlns:w16se="http://schemas.microsoft.com/office/word/2015/wordml/symex" xmlns:wpg="http://schemas.microsoft.com/office/word/2010/wordprocessingGroup" xmlns:wpi="http://schemas.microsoft.com/office/word/2010/wordprocessingInk" xmlns:wne="http://schemas.microsoft.com/office/word/2006/wordml" xmlns:wps="http://schemas.microsoft.com/office/word/2010/wordprocessingShape" mc:Ignorable="w14 w15 w16se w16cid w16 w16cex w16sdtdh w16du wp14">
+<w16cid:commentsIds xmlns:wpc="http://schemas.microsoft.com/office/word/2010/wordprocessingCanvas" xmlns:cx="http://schemas.microsoft.com/office/drawing/2014/chartex" xmlns:cx1="http://schemas.microsoft.com/office/drawing/2015/9/8/chartex" xmlns:cx2="http://schemas.microsoft.com/office/drawing/2015/10/21/chartex" xmlns:cx3="http://schemas.microsoft.com/office/drawing/2016/5/9/chartex" xmlns:cx4="http://schemas.microsoft.com/office/drawing/2016/5/10/chartex" xmlns:cx5="http://schemas.microsoft.com/office/drawing/2016/5/11/chartex" xmlns:cx6="http://schemas.microsoft.com/office/drawing/2016/5/12/chartex" xmlns:cx7="http://schemas.microsoft.com/office/drawing/2016/5/13/chartex" xmlns:cx8="http://schemas.microsoft.com/office/drawing/2016/5/14/chartex" xmlns:mc="http://schemas.openxmlformats.org/markup-compatibility/2006" xmlns:aink="http://schemas.microsoft.com/office/drawing/2016/ink" xmlns:am3d="http://schemas.microsoft.com/office/drawing/2017/model3d" xmlns:o="urn:schemas-microsoft-com:office:office" xmlns:oel="http://schemas.microsoft.com/office/2019/extlst" xmlns:r="http://schemas.openxmlformats.org/officeDocument/2006/relationships" xmlns:m="http://schemas.openxmlformats.org/officeDocument/2006/math" xmlns:v="urn:schemas-microsoft-com:vml" xmlns:wp14="http://schemas.microsoft.com/office/word/2010/wordprocessingDrawing" xmlns:wp="http://schemas.openxmlformats.org/drawingml/2006/wordprocessingDrawing" xmlns:w10="urn:schemas-microsoft-com:office:word" xmlns:w="http://schemas.openxmlformats.org/wordprocessingml/2006/main" xmlns:w14="http://schemas.microsoft.com/office/word/2010/wordml" xmlns:w15="http://schemas.microsoft.com/office/word/2012/wordml" xmlns:w16cex="http://schemas.microsoft.com/office/word/2018/wordml/cex" xmlns:w16cid="http://schemas.microsoft.com/office/word/2016/wordml/cid" xmlns:w16="http://schemas.microsoft.com/office/word/2018/wordml" xmlns:w16du="http://schemas.microsoft.com/office/word/2023/wordml/word16du" xmlns:w16sdtdh="http://schemas.microsoft.com/office/word/2020/wordml/sdtdatahash" xmlns:w16sdtfl="http://schemas.microsoft.com/office/word/2024/wordml/sdtformatlock" xmlns:w16se="http://schemas.microsoft.com/office/word/2015/wordml/symex" xmlns:wpg="http://schemas.microsoft.com/office/word/2010/wordprocessingGroup" xmlns:wpi="http://schemas.microsoft.com/office/word/2010/wordprocessingInk" xmlns:wne="http://schemas.microsoft.com/office/word/2006/wordml" xmlns:wps="http://schemas.microsoft.com/office/word/2010/wordprocessingShape" mc:Ignorable="w14 w15 w16se w16cid w16 w16cex w16sdtdh w16sdtfl w16du wp14">
   <w16cid:commentId w16cid:paraId="034318FB" w16cid:durableId="218E0726"/>
   <w16cid:commentId w16cid:paraId="75037570" w16cid:durableId="6633EED1"/>
   <w16cid:commentId w16cid:paraId="1340C9E6" w16cid:durableId="2B1415D4"/>
@@ -1521,7 +1592,7 @@
 </file>
 
 <file path=word/numbering.xml><?xml version="1.0" encoding="utf-8"?>
-<w:numbering xmlns:wpc="http://schemas.microsoft.com/office/word/2010/wordprocessingCanvas" xmlns:cx="http://schemas.microsoft.com/office/drawing/2014/chartex" xmlns:cx1="http://schemas.microsoft.com/office/drawing/2015/9/8/chartex" xmlns:cx2="http://schemas.microsoft.com/office/drawing/2015/10/21/chartex" xmlns:cx3="http://schemas.microsoft.com/office/drawing/2016/5/9/chartex" xmlns:cx4="http://schemas.microsoft.com/office/drawing/2016/5/10/chartex" xmlns:cx5="http://schemas.microsoft.com/office/drawing/2016/5/11/chartex" xmlns:cx6="http://schemas.microsoft.com/office/drawing/2016/5/12/chartex" xmlns:cx7="http://schemas.microsoft.com/office/drawing/2016/5/13/chartex" xmlns:cx8="http://schemas.microsoft.com/office/drawing/2016/5/14/chartex" xmlns:mc="http://schemas.openxmlformats.org/markup-compatibility/2006" xmlns:aink="http://schemas.microsoft.com/office/drawing/2016/ink" xmlns:am3d="http://schemas.microsoft.com/office/drawing/2017/model3d" xmlns:o="urn:schemas-microsoft-com:office:office" xmlns:oel="http://schemas.microsoft.com/office/2019/extlst" xmlns:r="http://schemas.openxmlformats.org/officeDocument/2006/relationships" xmlns:m="http://schemas.openxmlformats.org/officeDocument/2006/math" xmlns:v="urn:schemas-microsoft-com:vml" xmlns:wp14="http://schemas.microsoft.com/office/word/2010/wordprocessingDrawing" xmlns:wp="http://schemas.openxmlformats.org/drawingml/2006/wordprocessingDrawing" xmlns:w10="urn:schemas-microsoft-com:office:word" xmlns:w="http://schemas.openxmlformats.org/wordprocessingml/2006/main" xmlns:w14="http://schemas.microsoft.com/office/word/2010/wordml" xmlns:w15="http://schemas.microsoft.com/office/word/2012/wordml" xmlns:w16cex="http://schemas.microsoft.com/office/word/2018/wordml/cex" xmlns:w16cid="http://schemas.microsoft.com/office/word/2016/wordml/cid" xmlns:w16="http://schemas.microsoft.com/office/word/2018/wordml" xmlns:w16du="http://schemas.microsoft.com/office/word/2023/wordml/word16du" xmlns:w16sdtdh="http://schemas.microsoft.com/office/word/2020/wordml/sdtdatahash" xmlns:w16se="http://schemas.microsoft.com/office/word/2015/wordml/symex" xmlns:wpg="http://schemas.microsoft.com/office/word/2010/wordprocessingGroup" xmlns:wpi="http://schemas.microsoft.com/office/word/2010/wordprocessingInk" xmlns:wne="http://schemas.microsoft.com/office/word/2006/wordml" xmlns:wps="http://schemas.microsoft.com/office/word/2010/wordprocessingShape" mc:Ignorable="w14 w15 w16se w16cid w16 w16cex w16sdtdh w16du wp14">
+<w:numbering xmlns:wpc="http://schemas.microsoft.com/office/word/2010/wordprocessingCanvas" xmlns:cx="http://schemas.microsoft.com/office/drawing/2014/chartex" xmlns:cx1="http://schemas.microsoft.com/office/drawing/2015/9/8/chartex" xmlns:cx2="http://schemas.microsoft.com/office/drawing/2015/10/21/chartex" xmlns:cx3="http://schemas.microsoft.com/office/drawing/2016/5/9/chartex" xmlns:cx4="http://schemas.microsoft.com/office/drawing/2016/5/10/chartex" xmlns:cx5="http://schemas.microsoft.com/office/drawing/2016/5/11/chartex" xmlns:cx6="http://schemas.microsoft.com/office/drawing/2016/5/12/chartex" xmlns:cx7="http://schemas.microsoft.com/office/drawing/2016/5/13/chartex" xmlns:cx8="http://schemas.microsoft.com/office/drawing/2016/5/14/chartex" xmlns:mc="http://schemas.openxmlformats.org/markup-compatibility/2006" xmlns:aink="http://schemas.microsoft.com/office/drawing/2016/ink" xmlns:am3d="http://schemas.microsoft.com/office/drawing/2017/model3d" xmlns:o="urn:schemas-microsoft-com:office:office" xmlns:oel="http://schemas.microsoft.com/office/2019/extlst" xmlns:r="http://schemas.openxmlformats.org/officeDocument/2006/relationships" xmlns:m="http://schemas.openxmlformats.org/officeDocument/2006/math" xmlns:v="urn:schemas-microsoft-com:vml" xmlns:wp14="http://schemas.microsoft.com/office/word/2010/wordprocessingDrawing" xmlns:wp="http://schemas.openxmlformats.org/drawingml/2006/wordprocessingDrawing" xmlns:w10="urn:schemas-microsoft-com:office:word" xmlns:w="http://schemas.openxmlformats.org/wordprocessingml/2006/main" xmlns:w14="http://schemas.microsoft.com/office/word/2010/wordml" xmlns:w15="http://schemas.microsoft.com/office/word/2012/wordml" xmlns:w16cex="http://schemas.microsoft.com/office/word/2018/wordml/cex" xmlns:w16cid="http://schemas.microsoft.com/office/word/2016/wordml/cid" xmlns:w16="http://schemas.microsoft.com/office/word/2018/wordml" xmlns:w16du="http://schemas.microsoft.com/office/word/2023/wordml/word16du" xmlns:w16sdtdh="http://schemas.microsoft.com/office/word/2020/wordml/sdtdatahash" xmlns:w16sdtfl="http://schemas.microsoft.com/office/word/2024/wordml/sdtformatlock" xmlns:w16se="http://schemas.microsoft.com/office/word/2015/wordml/symex" xmlns:wpg="http://schemas.microsoft.com/office/word/2010/wordprocessingGroup" xmlns:wpi="http://schemas.microsoft.com/office/word/2010/wordprocessingInk" xmlns:wne="http://schemas.microsoft.com/office/word/2006/wordml" xmlns:wps="http://schemas.microsoft.com/office/word/2010/wordprocessingShape" mc:Ignorable="w14 w15 w16se w16cid w16 w16cex w16sdtdh w16sdtfl w16du wp14">
   <w:abstractNum w:abstractNumId="0" w15:restartNumberingAfterBreak="0">
     <w:nsid w:val="025CF5B5"/>
     <w:multiLevelType w:val="hybridMultilevel"/>
@@ -5097,7 +5168,7 @@
 </file>
 
 <file path=word/people.xml><?xml version="1.0" encoding="utf-8"?>
-<w15:people xmlns:wpc="http://schemas.microsoft.com/office/word/2010/wordprocessingCanvas" xmlns:cx="http://schemas.microsoft.com/office/drawing/2014/chartex" xmlns:cx1="http://schemas.microsoft.com/office/drawing/2015/9/8/chartex" xmlns:cx2="http://schemas.microsoft.com/office/drawing/2015/10/21/chartex" xmlns:cx3="http://schemas.microsoft.com/office/drawing/2016/5/9/chartex" xmlns:cx4="http://schemas.microsoft.com/office/drawing/2016/5/10/chartex" xmlns:cx5="http://schemas.microsoft.com/office/drawing/2016/5/11/chartex" xmlns:cx6="http://schemas.microsoft.com/office/drawing/2016/5/12/chartex" xmlns:cx7="http://schemas.microsoft.com/office/drawing/2016/5/13/chartex" xmlns:cx8="http://schemas.microsoft.com/office/drawing/2016/5/14/chartex" xmlns:mc="http://schemas.openxmlformats.org/markup-compatibility/2006" xmlns:aink="http://schemas.microsoft.com/office/drawing/2016/ink" xmlns:am3d="http://schemas.microsoft.com/office/drawing/2017/model3d" xmlns:o="urn:schemas-microsoft-com:office:office" xmlns:oel="http://schemas.microsoft.com/office/2019/extlst" xmlns:r="http://schemas.openxmlformats.org/officeDocument/2006/relationships" xmlns:m="http://schemas.openxmlformats.org/officeDocument/2006/math" xmlns:v="urn:schemas-microsoft-com:vml" xmlns:wp14="http://schemas.microsoft.com/office/word/2010/wordprocessingDrawing" xmlns:wp="http://schemas.openxmlformats.org/drawingml/2006/wordprocessingDrawing" xmlns:w10="urn:schemas-microsoft-com:office:word" xmlns:w="http://schemas.openxmlformats.org/wordprocessingml/2006/main" xmlns:w14="http://schemas.microsoft.com/office/word/2010/wordml" xmlns:w15="http://schemas.microsoft.com/office/word/2012/wordml" xmlns:w16cex="http://schemas.microsoft.com/office/word/2018/wordml/cex" xmlns:w16cid="http://schemas.microsoft.com/office/word/2016/wordml/cid" xmlns:w16="http://schemas.microsoft.com/office/word/2018/wordml" xmlns:w16du="http://schemas.microsoft.com/office/word/2023/wordml/word16du" xmlns:w16sdtdh="http://schemas.microsoft.com/office/word/2020/wordml/sdtdatahash" xmlns:w16se="http://schemas.microsoft.com/office/word/2015/wordml/symex" xmlns:wpg="http://schemas.microsoft.com/office/word/2010/wordprocessingGroup" xmlns:wpi="http://schemas.microsoft.com/office/word/2010/wordprocessingInk" xmlns:wne="http://schemas.microsoft.com/office/word/2006/wordml" xmlns:wps="http://schemas.microsoft.com/office/word/2010/wordprocessingShape" mc:Ignorable="w14 w15 w16se w16cid w16 w16cex w16sdtdh w16du wp14">
+<w15:people xmlns:wpc="http://schemas.microsoft.com/office/word/2010/wordprocessingCanvas" xmlns:cx="http://schemas.microsoft.com/office/drawing/2014/chartex" xmlns:cx1="http://schemas.microsoft.com/office/drawing/2015/9/8/chartex" xmlns:cx2="http://schemas.microsoft.com/office/drawing/2015/10/21/chartex" xmlns:cx3="http://schemas.microsoft.com/office/drawing/2016/5/9/chartex" xmlns:cx4="http://schemas.microsoft.com/office/drawing/2016/5/10/chartex" xmlns:cx5="http://schemas.microsoft.com/office/drawing/2016/5/11/chartex" xmlns:cx6="http://schemas.microsoft.com/office/drawing/2016/5/12/chartex" xmlns:cx7="http://schemas.microsoft.com/office/drawing/2016/5/13/chartex" xmlns:cx8="http://schemas.microsoft.com/office/drawing/2016/5/14/chartex" xmlns:mc="http://schemas.openxmlformats.org/markup-compatibility/2006" xmlns:aink="http://schemas.microsoft.com/office/drawing/2016/ink" xmlns:am3d="http://schemas.microsoft.com/office/drawing/2017/model3d" xmlns:o="urn:schemas-microsoft-com:office:office" xmlns:oel="http://schemas.microsoft.com/office/2019/extlst" xmlns:r="http://schemas.openxmlformats.org/officeDocument/2006/relationships" xmlns:m="http://schemas.openxmlformats.org/officeDocument/2006/math" xmlns:v="urn:schemas-microsoft-com:vml" xmlns:wp14="http://schemas.microsoft.com/office/word/2010/wordprocessingDrawing" xmlns:wp="http://schemas.openxmlformats.org/drawingml/2006/wordprocessingDrawing" xmlns:w10="urn:schemas-microsoft-com:office:word" xmlns:w="http://schemas.openxmlformats.org/wordprocessingml/2006/main" xmlns:w14="http://schemas.microsoft.com/office/word/2010/wordml" xmlns:w15="http://schemas.microsoft.com/office/word/2012/wordml" xmlns:w16cex="http://schemas.microsoft.com/office/word/2018/wordml/cex" xmlns:w16cid="http://schemas.microsoft.com/office/word/2016/wordml/cid" xmlns:w16="http://schemas.microsoft.com/office/word/2018/wordml" xmlns:w16du="http://schemas.microsoft.com/office/word/2023/wordml/word16du" xmlns:w16sdtdh="http://schemas.microsoft.com/office/word/2020/wordml/sdtdatahash" xmlns:w16sdtfl="http://schemas.microsoft.com/office/word/2024/wordml/sdtformatlock" xmlns:w16se="http://schemas.microsoft.com/office/word/2015/wordml/symex" xmlns:wpg="http://schemas.microsoft.com/office/word/2010/wordprocessingGroup" xmlns:wpi="http://schemas.microsoft.com/office/word/2010/wordprocessingInk" xmlns:wne="http://schemas.microsoft.com/office/word/2006/wordml" xmlns:wps="http://schemas.microsoft.com/office/word/2010/wordprocessingShape" mc:Ignorable="w14 w15 w16se w16cid w16 w16cex w16sdtdh w16sdtfl w16du wp14">
   <w15:person w15:author="f.tentori4@campus.unimib.it">
     <w15:presenceInfo w15:providerId="AD" w15:userId="S::f.tentori4@campus.unimib.it::d44885af-1cfc-4c31-b9f5-78e6dea907b5"/>
   </w15:person>
@@ -5108,7 +5179,7 @@
 </file>
 
 <file path=word/styles.xml><?xml version="1.0" encoding="utf-8"?>
-<w:styles xmlns:mc="http://schemas.openxmlformats.org/markup-compatibility/2006" xmlns:r="http://schemas.openxmlformats.org/officeDocument/2006/relationships" xmlns:w="http://schemas.openxmlformats.org/wordprocessingml/2006/main" xmlns:w14="http://schemas.microsoft.com/office/word/2010/wordml" xmlns:w15="http://schemas.microsoft.com/office/word/2012/wordml" xmlns:w16cex="http://schemas.microsoft.com/office/word/2018/wordml/cex" xmlns:w16cid="http://schemas.microsoft.com/office/word/2016/wordml/cid" xmlns:w16="http://schemas.microsoft.com/office/word/2018/wordml" xmlns:w16du="http://schemas.microsoft.com/office/word/2023/wordml/word16du" xmlns:w16sdtdh="http://schemas.microsoft.com/office/word/2020/wordml/sdtdatahash" xmlns:w16se="http://schemas.microsoft.com/office/word/2015/wordml/symex" mc:Ignorable="w14 w15 w16se w16cid w16 w16cex w16sdtdh w16du">
+<w:styles xmlns:mc="http://schemas.openxmlformats.org/markup-compatibility/2006" xmlns:r="http://schemas.openxmlformats.org/officeDocument/2006/relationships" xmlns:w="http://schemas.openxmlformats.org/wordprocessingml/2006/main" xmlns:w14="http://schemas.microsoft.com/office/word/2010/wordml" xmlns:w15="http://schemas.microsoft.com/office/word/2012/wordml" xmlns:w16cex="http://schemas.microsoft.com/office/word/2018/wordml/cex" xmlns:w16cid="http://schemas.microsoft.com/office/word/2016/wordml/cid" xmlns:w16="http://schemas.microsoft.com/office/word/2018/wordml" xmlns:w16du="http://schemas.microsoft.com/office/word/2023/wordml/word16du" xmlns:w16sdtdh="http://schemas.microsoft.com/office/word/2020/wordml/sdtdatahash" xmlns:w16sdtfl="http://schemas.microsoft.com/office/word/2024/wordml/sdtformatlock" xmlns:w16se="http://schemas.microsoft.com/office/word/2015/wordml/symex" mc:Ignorable="w14 w15 w16se w16cid w16 w16cex w16sdtdh w16sdtfl w16du">
   <w:docDefaults>
     <w:rPrDefault>
       <w:rPr>
@@ -6442,27 +6513,6 @@
 </file>
 
 <file path=customXml/item1.xml><?xml version="1.0" encoding="utf-8"?>
-<?mso-contentType ?>
-<FormTemplates xmlns="http://schemas.microsoft.com/sharepoint/v3/contenttype/forms">
-  <Display>DocumentLibraryForm</Display>
-  <Edit>DocumentLibraryForm</Edit>
-  <New>DocumentLibraryForm</New>
-</FormTemplates>
-</file>
-
-<file path=customXml/item2.xml><?xml version="1.0" encoding="utf-8"?>
-<b:Sources xmlns:b="http://schemas.openxmlformats.org/officeDocument/2006/bibliography" xmlns="http://schemas.openxmlformats.org/officeDocument/2006/bibliography" SelectedStyle="\APASixthEditionOfficeOnline.xsl" StyleName="APA" Version="6"/>
-</file>
-
-<file path=customXml/item3.xml><?xml version="1.0" encoding="utf-8"?>
-<p:properties xmlns:p="http://schemas.microsoft.com/office/2006/metadata/properties" xmlns:xsi="http://www.w3.org/2001/XMLSchema-instance" xmlns:pc="http://schemas.microsoft.com/office/infopath/2007/PartnerControls">
-  <documentManagement>
-    <_activity xmlns="5a27f7c0-5079-4b07-ba64-6dc03dd2d3af" xsi:nil="true"/>
-  </documentManagement>
-</p:properties>
-</file>
-
-<file path=customXml/item4.xml><?xml version="1.0" encoding="utf-8"?>
 <ct:contentTypeSchema xmlns:ct="http://schemas.microsoft.com/office/2006/metadata/contentType" xmlns:ma="http://schemas.microsoft.com/office/2006/metadata/properties/metaAttributes" ct:_="" ma:_="" ma:contentTypeName="Documento" ma:contentTypeID="0x0101003574973502B84C42B74035BA8AADE1A3" ma:contentTypeVersion="9" ma:contentTypeDescription="Creare un nuovo documento." ma:contentTypeScope="" ma:versionID="1ba771f4a91505810405fb99ac35d176">
   <xsd:schema xmlns:xsd="http://www.w3.org/2001/XMLSchema" xmlns:xs="http://www.w3.org/2001/XMLSchema" xmlns:p="http://schemas.microsoft.com/office/2006/metadata/properties" xmlns:ns3="8f4f0557-6568-4af7-94c6-f11cb446b9b2" xmlns:ns4="5a27f7c0-5079-4b07-ba64-6dc03dd2d3af" targetNamespace="http://schemas.microsoft.com/office/2006/metadata/properties" ma:root="true" ma:fieldsID="a3481e8909782aae8d117dfcc8e1ba87" ns3:_="" ns4:_="">
     <xsd:import namespace="8f4f0557-6568-4af7-94c6-f11cb446b9b2"/>
@@ -6657,33 +6707,28 @@
 </ct:contentTypeSchema>
 </file>
 
-<file path=customXml/itemProps1.xml><?xml version="1.0" encoding="utf-8"?>
-<ds:datastoreItem xmlns:ds="http://schemas.openxmlformats.org/officeDocument/2006/customXml" ds:itemID="{98997AA3-7CE8-4868-B6FC-3CB5C609D63B}">
-  <ds:schemaRefs>
-    <ds:schemaRef ds:uri="http://schemas.microsoft.com/sharepoint/v3/contenttype/forms"/>
-  </ds:schemaRefs>
-</ds:datastoreItem>
+<file path=customXml/item2.xml><?xml version="1.0" encoding="utf-8"?>
+<p:properties xmlns:p="http://schemas.microsoft.com/office/2006/metadata/properties" xmlns:xsi="http://www.w3.org/2001/XMLSchema-instance" xmlns:pc="http://schemas.microsoft.com/office/infopath/2007/PartnerControls">
+  <documentManagement>
+    <_activity xmlns="5a27f7c0-5079-4b07-ba64-6dc03dd2d3af" xsi:nil="true"/>
+  </documentManagement>
+</p:properties>
 </file>
 
-<file path=customXml/itemProps2.xml><?xml version="1.0" encoding="utf-8"?>
-<ds:datastoreItem xmlns:ds="http://schemas.openxmlformats.org/officeDocument/2006/customXml" ds:itemID="{909AC0DF-D565-4744-A016-96BAFB9D56F1}">
-  <ds:schemaRefs>
-    <ds:schemaRef ds:uri="http://schemas.openxmlformats.org/officeDocument/2006/bibliography"/>
-  </ds:schemaRefs>
-</ds:datastoreItem>
+<file path=customXml/item3.xml><?xml version="1.0" encoding="utf-8"?>
+<b:Sources xmlns:b="http://schemas.openxmlformats.org/officeDocument/2006/bibliography" xmlns="http://schemas.openxmlformats.org/officeDocument/2006/bibliography" SelectedStyle="\APASixthEditionOfficeOnline.xsl" StyleName="APA" Version="6"/>
 </file>
 
-<file path=customXml/itemProps3.xml><?xml version="1.0" encoding="utf-8"?>
-<ds:datastoreItem xmlns:ds="http://schemas.openxmlformats.org/officeDocument/2006/customXml" ds:itemID="{BADA3533-255B-4B70-A611-79BA8B58773F}">
-  <ds:schemaRefs>
-    <ds:schemaRef ds:uri="http://schemas.microsoft.com/office/2006/metadata/properties"/>
-    <ds:schemaRef ds:uri="http://schemas.microsoft.com/office/infopath/2007/PartnerControls"/>
-    <ds:schemaRef ds:uri="5a27f7c0-5079-4b07-ba64-6dc03dd2d3af"/>
-  </ds:schemaRefs>
-</ds:datastoreItem>
+<file path=customXml/item4.xml><?xml version="1.0" encoding="utf-8"?>
+<?mso-contentType ?>
+<FormTemplates xmlns="http://schemas.microsoft.com/sharepoint/v3/contenttype/forms">
+  <Display>DocumentLibraryForm</Display>
+  <Edit>DocumentLibraryForm</Edit>
+  <New>DocumentLibraryForm</New>
+</FormTemplates>
 </file>
 
-<file path=customXml/itemProps4.xml><?xml version="1.0" encoding="utf-8"?>
+<file path=customXml/itemProps1.xml><?xml version="1.0" encoding="utf-8"?>
 <ds:datastoreItem xmlns:ds="http://schemas.openxmlformats.org/officeDocument/2006/customXml" ds:itemID="{511E4159-463A-40AA-8704-D15F61FF7516}">
   <ds:schemaRefs>
     <ds:schemaRef ds:uri="http://schemas.microsoft.com/office/2006/metadata/contentType"/>
@@ -6700,4 +6745,30 @@
     <ds:schemaRef ds:uri="http://schemas.microsoft.com/internal/obd"/>
   </ds:schemaRefs>
 </ds:datastoreItem>
+</file>
+
+<file path=customXml/itemProps2.xml><?xml version="1.0" encoding="utf-8"?>
+<ds:datastoreItem xmlns:ds="http://schemas.openxmlformats.org/officeDocument/2006/customXml" ds:itemID="{BADA3533-255B-4B70-A611-79BA8B58773F}">
+  <ds:schemaRefs>
+    <ds:schemaRef ds:uri="http://schemas.microsoft.com/office/2006/metadata/properties"/>
+    <ds:schemaRef ds:uri="http://schemas.microsoft.com/office/infopath/2007/PartnerControls"/>
+    <ds:schemaRef ds:uri="5a27f7c0-5079-4b07-ba64-6dc03dd2d3af"/>
+  </ds:schemaRefs>
+</ds:datastoreItem>
+</file>
+
+<file path=customXml/itemProps3.xml><?xml version="1.0" encoding="utf-8"?>
+<ds:datastoreItem xmlns:ds="http://schemas.openxmlformats.org/officeDocument/2006/customXml" ds:itemID="{909AC0DF-D565-4744-A016-96BAFB9D56F1}">
+  <ds:schemaRefs>
+    <ds:schemaRef ds:uri="http://schemas.openxmlformats.org/officeDocument/2006/bibliography"/>
+  </ds:schemaRefs>
+</ds:datastoreItem>
+</file>
+
+<file path=customXml/itemProps4.xml><?xml version="1.0" encoding="utf-8"?>
+<ds:datastoreItem xmlns:ds="http://schemas.openxmlformats.org/officeDocument/2006/customXml" ds:itemID="{98997AA3-7CE8-4868-B6FC-3CB5C609D63B}">
+  <ds:schemaRefs>
+    <ds:schemaRef ds:uri="http://schemas.microsoft.com/sharepoint/v3/contenttype/forms"/>
+  </ds:schemaRefs>
+</ds:datastoreItem>
 </file>
</xml_diff>